<commit_message>
regenerate cgl + seic_do goldens: pick up multi-letter level-0 markers
After widening _L0_RE to [A-Z]+\., overflow markers (AA./BB./...) are
correctly attached as numPr at level 0 and stripped from body text.
</commit_message>
<xml_diff>
--- a/tests/golden/cgl_original_formatted.docx
+++ b/tests/golden/cgl_original_formatted.docx
@@ -6435,17 +6435,11 @@
         </w:rPr>
         <w:jc w:val="left"/>
         <w:spacing w:after="200"/>
-        <w:ind w:left="720"/>
-      </w:pPr>
-      <w:r>
-        <w:rPr>
-          <w:rFonts w:ascii="Inter" w:hAnsi="Inter" w:eastAsia="Inter" w:cs="Inter"/>
-          <w:color w:val="000000"/>
-          <w:sz w:val="22"/>
-          <w:szCs w:val="22"/>
-        </w:rPr>
-        <w:t>AA. </w:t>
-      </w:r>
+        <w:numPr>
+          <w:ilvl w:val="0"/>
+          <w:numId w:val="9003"/>
+        </w:numPr>
+      </w:pPr>
       <w:r>
         <w:rPr>
           <w:b/>
@@ -6568,17 +6562,11 @@
         </w:rPr>
         <w:jc w:val="left"/>
         <w:spacing w:after="200"/>
-        <w:ind w:left="1440"/>
-      </w:pPr>
-      <w:r>
-        <w:rPr>
-          <w:rFonts w:ascii="Inter" w:hAnsi="Inter" w:eastAsia="Inter" w:cs="Inter"/>
-          <w:color w:val="000000"/>
-          <w:sz w:val="22"/>
-          <w:szCs w:val="22"/>
-        </w:rPr>
-        <w:t>AB. </w:t>
-      </w:r>
+        <w:numPr>
+          <w:ilvl w:val="0"/>
+          <w:numId w:val="9003"/>
+        </w:numPr>
+      </w:pPr>
       <w:r>
         <w:rPr>
           <w:b/>
@@ -6617,16 +6605,19 @@
         </w:rPr>
         <w:jc w:val="left"/>
         <w:spacing w:after="200"/>
-        <w:ind w:left="1440"/>
-      </w:pPr>
-      <w:r>
-        <w:rPr>
-          <w:rFonts w:ascii="Inter" w:hAnsi="Inter" w:eastAsia="Inter" w:cs="Inter"/>
-          <w:color w:val="000000"/>
-          <w:sz w:val="22"/>
-          <w:szCs w:val="22"/>
-        </w:rPr>
-        <w:t xml:space="preserve">AC.  </w:t>
+        <w:numPr>
+          <w:ilvl w:val="0"/>
+          <w:numId w:val="9003"/>
+        </w:numPr>
+      </w:pPr>
+      <w:r>
+        <w:rPr>
+          <w:rFonts w:ascii="Inter" w:hAnsi="Inter" w:eastAsia="Inter" w:cs="Inter"/>
+          <w:color w:val="000000"/>
+          <w:sz w:val="22"/>
+          <w:szCs w:val="22"/>
+        </w:rPr>
+        <w:t xml:space="preserve"> </w:t>
       </w:r>
       <w:r>
         <w:rPr>
@@ -6746,17 +6737,11 @@
         </w:rPr>
         <w:jc w:val="left"/>
         <w:spacing w:after="200"/>
-        <w:ind w:left="1440"/>
-      </w:pPr>
-      <w:r>
-        <w:rPr>
-          <w:rFonts w:ascii="Inter" w:hAnsi="Inter" w:eastAsia="Inter" w:cs="Inter"/>
-          <w:color w:val="000000"/>
-          <w:sz w:val="22"/>
-          <w:szCs w:val="22"/>
-        </w:rPr>
-        <w:t>AD. </w:t>
-      </w:r>
+        <w:numPr>
+          <w:ilvl w:val="0"/>
+          <w:numId w:val="9003"/>
+        </w:numPr>
+      </w:pPr>
       <w:r>
         <w:rPr>
           <w:b/>
@@ -6835,17 +6820,11 @@
         </w:rPr>
         <w:jc w:val="left"/>
         <w:spacing w:after="200"/>
-        <w:ind w:left="1440"/>
-      </w:pPr>
-      <w:r>
-        <w:rPr>
-          <w:rFonts w:ascii="Inter" w:hAnsi="Inter" w:eastAsia="Inter" w:cs="Inter"/>
-          <w:color w:val="000000"/>
-          <w:sz w:val="22"/>
-          <w:szCs w:val="22"/>
-        </w:rPr>
-        <w:t>AE. </w:t>
-      </w:r>
+        <w:numPr>
+          <w:ilvl w:val="0"/>
+          <w:numId w:val="9003"/>
+        </w:numPr>
+      </w:pPr>
       <w:r>
         <w:rPr>
           <w:b/>
@@ -6884,17 +6863,11 @@
         </w:rPr>
         <w:jc w:val="left"/>
         <w:spacing w:after="200"/>
-        <w:ind w:left="1440"/>
-      </w:pPr>
-      <w:r>
-        <w:rPr>
-          <w:rFonts w:ascii="Inter" w:hAnsi="Inter" w:eastAsia="Inter" w:cs="Inter"/>
-          <w:color w:val="000000"/>
-          <w:sz w:val="22"/>
-          <w:szCs w:val="22"/>
-        </w:rPr>
-        <w:t>AF. </w:t>
-      </w:r>
+        <w:numPr>
+          <w:ilvl w:val="0"/>
+          <w:numId w:val="9003"/>
+        </w:numPr>
+      </w:pPr>
       <w:r>
         <w:rPr>
           <w:b/>
@@ -6933,7 +6906,7 @@
         </w:rPr>
         <w:jc w:val="left"/>
         <w:spacing w:after="200"/>
-        <w:ind w:left="1440"/>
+        <w:ind w:left="720"/>
       </w:pPr>
       <w:r>
         <w:rPr>
@@ -7002,17 +6975,11 @@
         </w:rPr>
         <w:jc w:val="left"/>
         <w:spacing w:after="200"/>
-        <w:ind w:left="1440"/>
-      </w:pPr>
-      <w:r>
-        <w:rPr>
-          <w:rFonts w:ascii="Inter" w:hAnsi="Inter" w:eastAsia="Inter" w:cs="Inter"/>
-          <w:color w:val="000000"/>
-          <w:sz w:val="22"/>
-          <w:szCs w:val="22"/>
-        </w:rPr>
-        <w:t>AG. </w:t>
-      </w:r>
+        <w:numPr>
+          <w:ilvl w:val="0"/>
+          <w:numId w:val="9003"/>
+        </w:numPr>
+      </w:pPr>
       <w:r>
         <w:rPr>
           <w:b/>
@@ -7378,17 +7345,11 @@
         </w:rPr>
         <w:jc w:val="left"/>
         <w:spacing w:after="200"/>
-        <w:ind w:left="1440"/>
-      </w:pPr>
-      <w:r>
-        <w:rPr>
-          <w:rFonts w:ascii="Inter" w:hAnsi="Inter" w:eastAsia="Inter" w:cs="Inter"/>
-          <w:color w:val="000000"/>
-          <w:sz w:val="22"/>
-          <w:szCs w:val="22"/>
-        </w:rPr>
-        <w:t>AH. </w:t>
-      </w:r>
+        <w:numPr>
+          <w:ilvl w:val="0"/>
+          <w:numId w:val="9003"/>
+        </w:numPr>
+      </w:pPr>
       <w:r>
         <w:rPr>
           <w:b/>
@@ -7571,17 +7532,11 @@
         </w:rPr>
         <w:jc w:val="left"/>
         <w:spacing w:after="200"/>
-        <w:ind w:left="1440"/>
-      </w:pPr>
-      <w:r>
-        <w:rPr>
-          <w:rFonts w:ascii="Inter" w:hAnsi="Inter" w:eastAsia="Inter" w:cs="Inter"/>
-          <w:color w:val="000000"/>
-          <w:sz w:val="22"/>
-          <w:szCs w:val="22"/>
-        </w:rPr>
-        <w:t>AI. </w:t>
-      </w:r>
+        <w:numPr>
+          <w:ilvl w:val="0"/>
+          <w:numId w:val="9003"/>
+        </w:numPr>
+      </w:pPr>
       <w:r>
         <w:rPr>
           <w:b/>

</xml_diff>

<commit_message>
regenerate cgl + seic_do goldens: single-space marker separator
Picks up <w:suff w:val="space"/> in the abstractNum and the
all-leading-whitespace consume in _scan_leading_marker.
</commit_message>
<xml_diff>
--- a/tests/golden/cgl_original_formatted.docx
+++ b/tests/golden/cgl_original_formatted.docx
@@ -339,15 +339,6 @@
       </w:pPr>
       <w:r>
         <w:rPr>
-          <w:rFonts w:ascii="Inter" w:hAnsi="Inter" w:eastAsia="Inter" w:cs="Inter"/>
-          <w:color w:val="000000"/>
-          <w:sz w:val="22"/>
-          <w:szCs w:val="22"/>
-        </w:rPr>
-        <w:t xml:space="preserve"> </w:t>
-      </w:r>
-      <w:r>
-        <w:rPr>
           <w:b/>
           <w:bCs/>
           <w:rFonts w:ascii="Inter" w:hAnsi="Inter" w:eastAsia="Inter" w:cs="Inter"/>
@@ -531,15 +522,6 @@
       </w:pPr>
       <w:r>
         <w:rPr>
-          <w:rFonts w:ascii="Inter" w:hAnsi="Inter" w:eastAsia="Inter" w:cs="Inter"/>
-          <w:color w:val="000000"/>
-          <w:sz w:val="22"/>
-          <w:szCs w:val="22"/>
-        </w:rPr>
-        <w:t xml:space="preserve"> </w:t>
-      </w:r>
-      <w:r>
-        <w:rPr>
           <w:b/>
           <w:bCs/>
           <w:rFonts w:ascii="Inter" w:hAnsi="Inter" w:eastAsia="Inter" w:cs="Inter"/>
@@ -792,15 +774,6 @@
       </w:pPr>
       <w:r>
         <w:rPr>
-          <w:rFonts w:ascii="Inter" w:hAnsi="Inter" w:eastAsia="Inter" w:cs="Inter"/>
-          <w:color w:val="000000"/>
-          <w:sz w:val="22"/>
-          <w:szCs w:val="22"/>
-        </w:rPr>
-        <w:t xml:space="preserve"> </w:t>
-      </w:r>
-      <w:r>
-        <w:rPr>
           <w:b/>
           <w:bCs/>
           <w:rFonts w:ascii="Inter" w:hAnsi="Inter" w:eastAsia="Inter" w:cs="Inter"/>
@@ -978,7 +951,7 @@
           <w:sz w:val="22"/>
           <w:szCs w:val="22"/>
         </w:rPr>
-        <w:t xml:space="preserve"> We and you shall use our best efforts to agree upon a fair and proper allocation of </w:t>
+        <w:t xml:space="preserve">We and you shall use our best efforts to agree upon a fair and proper allocation of </w:t>
       </w:r>
       <w:r>
         <w:rPr>
@@ -1045,15 +1018,6 @@
       </w:pPr>
       <w:r>
         <w:rPr>
-          <w:rFonts w:ascii="Inter" w:hAnsi="Inter" w:eastAsia="Inter" w:cs="Inter"/>
-          <w:color w:val="000000"/>
-          <w:sz w:val="22"/>
-          <w:szCs w:val="22"/>
-        </w:rPr>
-        <w:t xml:space="preserve"> </w:t>
-      </w:r>
-      <w:r>
-        <w:rPr>
           <w:b/>
           <w:bCs/>
           <w:rFonts w:ascii="Inter" w:hAnsi="Inter" w:eastAsia="Inter" w:cs="Inter"/>
@@ -1336,15 +1300,6 @@
       </w:pPr>
       <w:r>
         <w:rPr>
-          <w:rFonts w:ascii="Inter" w:hAnsi="Inter" w:eastAsia="Inter" w:cs="Inter"/>
-          <w:color w:val="000000"/>
-          <w:sz w:val="22"/>
-          <w:szCs w:val="22"/>
-        </w:rPr>
-        <w:t xml:space="preserve"> </w:t>
-      </w:r>
-      <w:r>
-        <w:rPr>
           <w:b/>
           <w:bCs/>
           <w:rFonts w:ascii="Inter" w:hAnsi="Inter" w:eastAsia="Inter" w:cs="Inter"/>
@@ -1597,15 +1552,6 @@
       </w:pPr>
       <w:r>
         <w:rPr>
-          <w:rFonts w:ascii="Inter" w:hAnsi="Inter" w:eastAsia="Inter" w:cs="Inter"/>
-          <w:color w:val="000000"/>
-          <w:sz w:val="22"/>
-          <w:szCs w:val="22"/>
-        </w:rPr>
-        <w:t xml:space="preserve"> </w:t>
-      </w:r>
-      <w:r>
-        <w:rPr>
           <w:b/>
           <w:bCs/>
           <w:rFonts w:ascii="Inter" w:hAnsi="Inter" w:eastAsia="Inter" w:cs="Inter"/>
@@ -1669,15 +1615,6 @@
       </w:pPr>
       <w:r>
         <w:rPr>
-          <w:rFonts w:ascii="Inter" w:hAnsi="Inter" w:eastAsia="Inter" w:cs="Inter"/>
-          <w:color w:val="000000"/>
-          <w:sz w:val="22"/>
-          <w:szCs w:val="22"/>
-        </w:rPr>
-        <w:t xml:space="preserve"> </w:t>
-      </w:r>
-      <w:r>
-        <w:rPr>
           <w:b/>
           <w:bCs/>
           <w:rFonts w:ascii="Inter" w:hAnsi="Inter" w:eastAsia="Inter" w:cs="Inter"/>
@@ -1731,15 +1668,6 @@
       </w:pPr>
       <w:r>
         <w:rPr>
-          <w:rFonts w:ascii="Inter" w:hAnsi="Inter" w:eastAsia="Inter" w:cs="Inter"/>
-          <w:color w:val="000000"/>
-          <w:sz w:val="22"/>
-          <w:szCs w:val="22"/>
-        </w:rPr>
-        <w:t xml:space="preserve"> </w:t>
-      </w:r>
-      <w:r>
-        <w:rPr>
           <w:b/>
           <w:bCs/>
           <w:rFonts w:ascii="Inter" w:hAnsi="Inter" w:eastAsia="Inter" w:cs="Inter"/>
@@ -1907,15 +1835,6 @@
       <w:proofErr w:type="spellEnd"/>
       <w:r>
         <w:rPr>
-          <w:rFonts w:ascii="Inter" w:hAnsi="Inter" w:eastAsia="Inter" w:cs="Inter"/>
-          <w:color w:val="000000"/>
-          <w:sz w:val="22"/>
-          <w:szCs w:val="22"/>
-        </w:rPr>
-        <w:t xml:space="preserve"> </w:t>
-      </w:r>
-      <w:r>
-        <w:rPr>
           <w:b/>
           <w:bCs/>
           <w:rFonts w:ascii="Inter" w:hAnsi="Inter" w:eastAsia="Inter" w:cs="Inter"/>
@@ -2088,15 +2007,6 @@
       </w:pPr>
       <w:r>
         <w:rPr>
-          <w:rFonts w:ascii="Inter" w:hAnsi="Inter" w:eastAsia="Inter" w:cs="Inter"/>
-          <w:color w:val="000000"/>
-          <w:sz w:val="22"/>
-          <w:szCs w:val="22"/>
-        </w:rPr>
-        <w:t xml:space="preserve"> </w:t>
-      </w:r>
-      <w:r>
-        <w:rPr>
           <w:b/>
           <w:bCs/>
           <w:rFonts w:ascii="Inter" w:hAnsi="Inter" w:eastAsia="Inter" w:cs="Inter"/>
@@ -3142,15 +3052,6 @@
       </w:pPr>
       <w:r>
         <w:rPr>
-          <w:rFonts w:ascii="Inter" w:hAnsi="Inter" w:eastAsia="Inter" w:cs="Inter"/>
-          <w:color w:val="000000"/>
-          <w:sz w:val="22"/>
-          <w:szCs w:val="22"/>
-        </w:rPr>
-        <w:t xml:space="preserve"> </w:t>
-      </w:r>
-      <w:r>
-        <w:rPr>
           <w:b/>
           <w:bCs/>
           <w:rFonts w:ascii="Inter" w:hAnsi="Inter" w:eastAsia="Inter" w:cs="Inter"/>
@@ -3214,15 +3115,6 @@
       </w:pPr>
       <w:r>
         <w:rPr>
-          <w:rFonts w:ascii="Inter" w:hAnsi="Inter" w:eastAsia="Inter" w:cs="Inter"/>
-          <w:color w:val="000000"/>
-          <w:sz w:val="22"/>
-          <w:szCs w:val="22"/>
-        </w:rPr>
-        <w:t xml:space="preserve"> </w:t>
-      </w:r>
-      <w:r>
-        <w:rPr>
           <w:b/>
           <w:bCs/>
           <w:rFonts w:ascii="Inter" w:hAnsi="Inter" w:eastAsia="Inter" w:cs="Inter"/>
@@ -3332,7 +3224,6 @@
           <w:szCs w:val="22"/>
         </w:rPr>
         <w:lastRenderedPageBreak/>
-        <w:t xml:space="preserve"> </w:t>
       </w:r>
       <w:r>
         <w:rPr>
@@ -3419,15 +3310,6 @@
       </w:pPr>
       <w:r>
         <w:rPr>
-          <w:rFonts w:ascii="Inter" w:hAnsi="Inter" w:eastAsia="Inter" w:cs="Inter"/>
-          <w:color w:val="000000"/>
-          <w:sz w:val="22"/>
-          <w:szCs w:val="22"/>
-        </w:rPr>
-        <w:t xml:space="preserve"> </w:t>
-      </w:r>
-      <w:r>
-        <w:rPr>
           <w:b/>
           <w:bCs/>
           <w:rFonts w:ascii="Inter" w:hAnsi="Inter" w:eastAsia="Inter" w:cs="Inter"/>
@@ -3511,15 +3393,6 @@
       </w:pPr>
       <w:r>
         <w:rPr>
-          <w:rFonts w:ascii="Inter" w:hAnsi="Inter" w:eastAsia="Inter" w:cs="Inter"/>
-          <w:color w:val="000000"/>
-          <w:sz w:val="22"/>
-          <w:szCs w:val="22"/>
-        </w:rPr>
-        <w:t xml:space="preserve"> </w:t>
-      </w:r>
-      <w:r>
-        <w:rPr>
           <w:b/>
           <w:bCs/>
           <w:rFonts w:ascii="Inter" w:hAnsi="Inter" w:eastAsia="Inter" w:cs="Inter"/>
@@ -3568,7 +3441,7 @@
           <w:sz w:val="22"/>
           <w:szCs w:val="22"/>
         </w:rPr>
-        <w:t xml:space="preserve"> the merger, consolidation, or combination of the </w:t>
+        <w:t xml:space="preserve">the merger, consolidation, or combination of the </w:t>
       </w:r>
       <w:r>
         <w:rPr>
@@ -3675,15 +3548,6 @@
       </w:pPr>
       <w:r>
         <w:rPr>
-          <w:rFonts w:ascii="Inter" w:hAnsi="Inter" w:eastAsia="Inter" w:cs="Inter"/>
-          <w:color w:val="000000"/>
-          <w:sz w:val="22"/>
-          <w:szCs w:val="22"/>
-        </w:rPr>
-        <w:t xml:space="preserve"> </w:t>
-      </w:r>
-      <w:r>
-        <w:rPr>
           <w:b/>
           <w:bCs/>
           <w:rFonts w:ascii="Inter" w:hAnsi="Inter" w:eastAsia="Inter" w:cs="Inter"/>
@@ -3727,15 +3591,6 @@
       </w:pPr>
       <w:r>
         <w:rPr>
-          <w:rFonts w:ascii="Inter" w:hAnsi="Inter" w:eastAsia="Inter" w:cs="Inter"/>
-          <w:color w:val="000000"/>
-          <w:sz w:val="22"/>
-          <w:szCs w:val="22"/>
-        </w:rPr>
-        <w:t xml:space="preserve"> </w:t>
-      </w:r>
-      <w:r>
-        <w:rPr>
           <w:b/>
           <w:bCs/>
           <w:rFonts w:ascii="Inter" w:hAnsi="Inter" w:eastAsia="Inter" w:cs="Inter"/>
@@ -3799,15 +3654,6 @@
       </w:pPr>
       <w:r>
         <w:rPr>
-          <w:rFonts w:ascii="Inter" w:hAnsi="Inter" w:eastAsia="Inter" w:cs="Inter"/>
-          <w:color w:val="000000"/>
-          <w:sz w:val="22"/>
-          <w:szCs w:val="22"/>
-        </w:rPr>
-        <w:t xml:space="preserve"> </w:t>
-      </w:r>
-      <w:r>
-        <w:rPr>
           <w:b/>
           <w:bCs/>
           <w:rFonts w:ascii="Inter" w:hAnsi="Inter" w:eastAsia="Inter" w:cs="Inter"/>
@@ -3856,7 +3702,7 @@
           <w:sz w:val="22"/>
           <w:szCs w:val="22"/>
         </w:rPr>
-        <w:t> the United States of America (including its territories and possessions), Puerto Rico, and Canada;</w:t>
+        <w:t>the United States of America (including its territories and possessions), Puerto Rico, and Canada;</w:t>
       </w:r>
     </w:p>
     <w:p>
@@ -3888,7 +3734,7 @@
           <w:sz w:val="22"/>
           <w:szCs w:val="22"/>
         </w:rPr>
-        <w:t xml:space="preserve"> international waters or airspace, but only if the </w:t>
+        <w:t xml:space="preserve">international waters or airspace, but only if the </w:t>
       </w:r>
       <w:r>
         <w:rPr>
@@ -3980,7 +3826,7 @@
           <w:sz w:val="22"/>
           <w:szCs w:val="22"/>
         </w:rPr>
-        <w:t xml:space="preserve"> all other parts of the world, if the </w:t>
+        <w:t xml:space="preserve">all other parts of the world, if the </w:t>
       </w:r>
       <w:r>
         <w:rPr>
@@ -4156,15 +4002,6 @@
       </w:pPr>
       <w:r>
         <w:rPr>
-          <w:rFonts w:ascii="Inter" w:hAnsi="Inter" w:eastAsia="Inter" w:cs="Inter"/>
-          <w:color w:val="000000"/>
-          <w:sz w:val="22"/>
-          <w:szCs w:val="22"/>
-        </w:rPr>
-        <w:t xml:space="preserve"> </w:t>
-      </w:r>
-      <w:r>
-        <w:rPr>
           <w:b/>
           <w:bCs/>
           <w:rFonts w:ascii="Inter" w:hAnsi="Inter" w:eastAsia="Inter" w:cs="Inter"/>
@@ -4274,7 +4111,6 @@
           <w:szCs w:val="22"/>
         </w:rPr>
         <w:lastRenderedPageBreak/>
-        <w:t xml:space="preserve"> </w:t>
       </w:r>
       <w:r>
         <w:rPr>
@@ -4326,7 +4162,7 @@
           <w:sz w:val="22"/>
           <w:szCs w:val="22"/>
         </w:rPr>
-        <w:t xml:space="preserve"> a written notice received by an </w:t>
+        <w:t xml:space="preserve">a written notice received by an </w:t>
       </w:r>
       <w:r>
         <w:rPr>
@@ -4478,7 +4314,7 @@
           <w:sz w:val="22"/>
           <w:szCs w:val="22"/>
         </w:rPr>
-        <w:t xml:space="preserve"> the filing of a civil lawsuit or arbitration proceeding against an </w:t>
+        <w:t xml:space="preserve">the filing of a civil lawsuit or arbitration proceeding against an </w:t>
       </w:r>
       <w:r>
         <w:rPr>
@@ -4565,15 +4401,6 @@
       </w:pPr>
       <w:r>
         <w:rPr>
-          <w:rFonts w:ascii="Inter" w:hAnsi="Inter" w:eastAsia="Inter" w:cs="Inter"/>
-          <w:color w:val="000000"/>
-          <w:sz w:val="22"/>
-          <w:szCs w:val="22"/>
-        </w:rPr>
-        <w:t xml:space="preserve"> </w:t>
-      </w:r>
-      <w:r>
-        <w:rPr>
           <w:b/>
           <w:bCs/>
           <w:rFonts w:ascii="Inter" w:hAnsi="Inter" w:eastAsia="Inter" w:cs="Inter"/>
@@ -4617,15 +4444,6 @@
       </w:pPr>
       <w:r>
         <w:rPr>
-          <w:rFonts w:ascii="Inter" w:hAnsi="Inter" w:eastAsia="Inter" w:cs="Inter"/>
-          <w:color w:val="000000"/>
-          <w:sz w:val="22"/>
-          <w:szCs w:val="22"/>
-        </w:rPr>
-        <w:t xml:space="preserve"> </w:t>
-      </w:r>
-      <w:r>
-        <w:rPr>
           <w:b/>
           <w:bCs/>
           <w:rFonts w:ascii="Inter" w:hAnsi="Inter" w:eastAsia="Inter" w:cs="Inter"/>
@@ -4689,15 +4507,6 @@
       </w:pPr>
       <w:r>
         <w:rPr>
-          <w:rFonts w:ascii="Inter" w:hAnsi="Inter" w:eastAsia="Inter" w:cs="Inter"/>
-          <w:color w:val="000000"/>
-          <w:sz w:val="22"/>
-          <w:szCs w:val="22"/>
-        </w:rPr>
-        <w:t xml:space="preserve"> </w:t>
-      </w:r>
-      <w:r>
-        <w:rPr>
           <w:b/>
           <w:bCs/>
           <w:rFonts w:ascii="Inter" w:hAnsi="Inter" w:eastAsia="Inter" w:cs="Inter"/>
@@ -4786,7 +4595,7 @@
           <w:sz w:val="22"/>
           <w:szCs w:val="22"/>
         </w:rPr>
-        <w:t xml:space="preserve"> it incorporates </w:t>
+        <w:t xml:space="preserve">it incorporates </w:t>
       </w:r>
       <w:r>
         <w:rPr>
@@ -4858,7 +4667,7 @@
           <w:sz w:val="22"/>
           <w:szCs w:val="22"/>
         </w:rPr>
-        <w:t xml:space="preserve"> you have failed to fulfill the terms of a contract or agreement; if such property can be restored to use by the repair, replacement, adjustment, or removal of </w:t>
+        <w:t xml:space="preserve">you have failed to fulfill the terms of a contract or agreement; if such property can be restored to use by the repair, replacement, adjustment, or removal of </w:t>
       </w:r>
       <w:r>
         <w:rPr>
@@ -4945,15 +4754,6 @@
       </w:pPr>
       <w:r>
         <w:rPr>
-          <w:rFonts w:ascii="Inter" w:hAnsi="Inter" w:eastAsia="Inter" w:cs="Inter"/>
-          <w:color w:val="000000"/>
-          <w:sz w:val="22"/>
-          <w:szCs w:val="22"/>
-        </w:rPr>
-        <w:t xml:space="preserve"> </w:t>
-      </w:r>
-      <w:r>
-        <w:rPr>
           <w:b/>
           <w:bCs/>
           <w:rFonts w:ascii="Inter" w:hAnsi="Inter" w:eastAsia="Inter" w:cs="Inter"/>
@@ -5037,15 +4837,6 @@
       </w:pPr>
       <w:r>
         <w:rPr>
-          <w:rFonts w:ascii="Inter" w:hAnsi="Inter" w:eastAsia="Inter" w:cs="Inter"/>
-          <w:color w:val="000000"/>
-          <w:sz w:val="22"/>
-          <w:szCs w:val="22"/>
-        </w:rPr>
-        <w:t xml:space="preserve"> </w:t>
-      </w:r>
-      <w:r>
-        <w:rPr>
           <w:b/>
           <w:bCs/>
           <w:rFonts w:ascii="Inter" w:hAnsi="Inter" w:eastAsia="Inter" w:cs="Inter"/>
@@ -5094,7 +4885,7 @@
           <w:sz w:val="22"/>
           <w:szCs w:val="22"/>
         </w:rPr>
-        <w:t xml:space="preserve"> the </w:t>
+        <w:t xml:space="preserve">the </w:t>
       </w:r>
       <w:r>
         <w:rPr>
@@ -5146,7 +4937,7 @@
           <w:sz w:val="22"/>
           <w:szCs w:val="22"/>
         </w:rPr>
-        <w:t xml:space="preserve"> an </w:t>
+        <w:t xml:space="preserve">an </w:t>
       </w:r>
       <w:r>
         <w:rPr>
@@ -5193,15 +4984,6 @@
       </w:pPr>
       <w:r>
         <w:rPr>
-          <w:rFonts w:ascii="Inter" w:hAnsi="Inter" w:eastAsia="Inter" w:cs="Inter"/>
-          <w:color w:val="000000"/>
-          <w:sz w:val="22"/>
-          <w:szCs w:val="22"/>
-        </w:rPr>
-        <w:t xml:space="preserve"> </w:t>
-      </w:r>
-      <w:r>
-        <w:rPr>
           <w:b/>
           <w:bCs/>
           <w:rFonts w:ascii="Inter" w:hAnsi="Inter" w:eastAsia="Inter" w:cs="Inter"/>
@@ -5376,15 +5158,6 @@
       </w:pPr>
       <w:r>
         <w:rPr>
-          <w:rFonts w:ascii="Inter" w:hAnsi="Inter" w:eastAsia="Inter" w:cs="Inter"/>
-          <w:color w:val="000000"/>
-          <w:sz w:val="22"/>
-          <w:szCs w:val="22"/>
-        </w:rPr>
-        <w:t xml:space="preserve"> </w:t>
-      </w:r>
-      <w:r>
-        <w:rPr>
           <w:b/>
           <w:bCs/>
           <w:rFonts w:ascii="Inter" w:hAnsi="Inter" w:eastAsia="Inter" w:cs="Inter"/>
@@ -5428,15 +5201,6 @@
       </w:pPr>
       <w:r>
         <w:rPr>
-          <w:rFonts w:ascii="Inter" w:hAnsi="Inter" w:eastAsia="Inter" w:cs="Inter"/>
-          <w:color w:val="000000"/>
-          <w:sz w:val="22"/>
-          <w:szCs w:val="22"/>
-        </w:rPr>
-        <w:t xml:space="preserve"> </w:t>
-      </w:r>
-      <w:r>
-        <w:rPr>
           <w:b/>
           <w:bCs/>
           <w:rFonts w:ascii="Inter" w:hAnsi="Inter" w:eastAsia="Inter" w:cs="Inter"/>
@@ -5593,15 +5357,6 @@
       </w:pPr>
       <w:r>
         <w:rPr>
-          <w:rFonts w:ascii="Inter" w:hAnsi="Inter" w:eastAsia="Inter" w:cs="Inter"/>
-          <w:color w:val="000000"/>
-          <w:sz w:val="22"/>
-          <w:szCs w:val="22"/>
-        </w:rPr>
-        <w:t xml:space="preserve"> </w:t>
-      </w:r>
-      <w:r>
-        <w:rPr>
           <w:b/>
           <w:bCs/>
           <w:rFonts w:ascii="Inter" w:hAnsi="Inter" w:eastAsia="Inter" w:cs="Inter"/>
@@ -5756,7 +5511,7 @@
           <w:sz w:val="22"/>
           <w:szCs w:val="22"/>
         </w:rPr>
-        <w:t xml:space="preserve"> false arrest, detention, or imprisonment; </w:t>
+        <w:t xml:space="preserve">false arrest, detention, or imprisonment; </w:t>
       </w:r>
     </w:p>
     <w:p>
@@ -5788,7 +5543,7 @@
           <w:sz w:val="22"/>
           <w:szCs w:val="22"/>
         </w:rPr>
-        <w:t xml:space="preserve"> malicious prosecution or wrongful eviction; </w:t>
+        <w:t xml:space="preserve">malicious prosecution or wrongful eviction; </w:t>
       </w:r>
     </w:p>
     <w:p>
@@ -5820,7 +5575,7 @@
           <w:sz w:val="22"/>
           <w:szCs w:val="22"/>
         </w:rPr>
-        <w:t xml:space="preserve"> wrongful entry, or invasion of the right of private occupancy of premises a person occupies, when committed by or for the owner, landlord, or lessor;  4.  publication, in any manner, of material that slanders or libels a person or organization, or that disparages their goods, products, or services; or  5.  publication, in any manner, of material that violates a person’s right of privacy, use of another’s advertising idea in your </w:t>
+        <w:t xml:space="preserve">wrongful entry, or invasion of the right of private occupancy of premises a person occupies, when committed by or for the owner, landlord, or lessor;  4.  publication, in any manner, of material that slanders or libels a person or organization, or that disparages their goods, products, or services; or  5.  publication, in any manner, of material that violates a person’s right of privacy, use of another’s advertising idea in your </w:t>
       </w:r>
       <w:r>
         <w:rPr>
@@ -6138,7 +5893,7 @@
           <w:sz w:val="22"/>
           <w:szCs w:val="22"/>
         </w:rPr>
-        <w:t xml:space="preserve"> products that are still in your physical possession; or </w:t>
+        <w:t xml:space="preserve">products that are still in your physical possession; or </w:t>
       </w:r>
     </w:p>
     <w:p>
@@ -6170,7 +5925,7 @@
           <w:sz w:val="22"/>
           <w:szCs w:val="22"/>
         </w:rPr>
-        <w:t xml:space="preserve"> work that has not yet been completed or abandoned. </w:t>
+        <w:t xml:space="preserve">work that has not yet been completed or abandoned. </w:t>
       </w:r>
       <w:r>
         <w:rPr>
@@ -6224,7 +5979,7 @@
           <w:sz w:val="22"/>
           <w:szCs w:val="22"/>
         </w:rPr>
-        <w:t xml:space="preserve"> when </w:t>
+        <w:t xml:space="preserve">when </w:t>
       </w:r>
       <w:proofErr w:type="gramStart"/>
       <w:r>
@@ -6490,7 +6245,7 @@
           <w:sz w:val="22"/>
           <w:szCs w:val="22"/>
         </w:rPr>
-        <w:t xml:space="preserve"> physical injury to tangible property, including all resulting loss of use of that property. All such loss of use shall be deemed to occur at the time of the physical injury that caused it; or </w:t>
+        <w:t xml:space="preserve">physical injury to tangible property, including all resulting loss of use of that property. All such loss of use shall be deemed to occur at the time of the physical injury that caused it; or </w:t>
       </w:r>
     </w:p>
     <w:p>
@@ -6522,7 +6277,7 @@
           <w:sz w:val="22"/>
           <w:szCs w:val="22"/>
         </w:rPr>
-        <w:t xml:space="preserve"> loss of use of tangible property that is not physically injured. For the purposes of this insurance, electronic data, which includes but is not limited to facts or programs stored as or on, created or used on, or transmitted to or from computer software, including systems and applications software, hard or floppy disks, CD-ROMs, tapes, drives, cells, data processing devices or any other media used with electronically controlled equipment, is not tangible property. All such loss of use shall be deemed to occur at the time of the </w:t>
+        <w:t xml:space="preserve">loss of use of tangible property that is not physically injured. For the purposes of this insurance, electronic data, which includes but is not limited to facts or programs stored as or on, created or used on, or transmitted to or from computer software, including systems and applications software, hard or floppy disks, CD-ROMs, tapes, drives, cells, data processing devices or any other media used with electronically controlled equipment, is not tangible property. All such loss of use shall be deemed to occur at the time of the </w:t>
       </w:r>
       <w:r>
         <w:rPr>
@@ -6612,15 +6367,6 @@
       </w:pPr>
       <w:r>
         <w:rPr>
-          <w:rFonts w:ascii="Inter" w:hAnsi="Inter" w:eastAsia="Inter" w:cs="Inter"/>
-          <w:color w:val="000000"/>
-          <w:sz w:val="22"/>
-          <w:szCs w:val="22"/>
-        </w:rPr>
-        <w:t xml:space="preserve"> </w:t>
-      </w:r>
-      <w:r>
-        <w:rPr>
           <w:b/>
           <w:bCs/>
           <w:rFonts w:ascii="Inter" w:hAnsi="Inter" w:eastAsia="Inter" w:cs="Inter"/>
@@ -7110,7 +6856,7 @@
           <w:sz w:val="22"/>
           <w:szCs w:val="22"/>
         </w:rPr>
-        <w:t xml:space="preserve"> is maintained mainly to provide mobility to permanently mounted equipment or to perform a specialized task other than transporting persons or cargo; or  2.  is otherwise a vehicle not intended for regular travel on public roads. </w:t>
+        <w:t xml:space="preserve">is maintained mainly to provide mobility to permanently mounted equipment or to perform a specialized task other than transporting persons or cargo; or  2.  is otherwise a vehicle not intended for regular travel on public roads. </w:t>
       </w:r>
     </w:p>
     <w:p>
@@ -7212,7 +6958,7 @@
           <w:szCs w:val="22"/>
         </w:rPr>
         <w:lastRenderedPageBreak/>
-        <w:t xml:space="preserve"> any land vehicle designed for or used in travel on public roads; </w:t>
+        <w:t xml:space="preserve">any land vehicle designed for or used in travel on public roads; </w:t>
       </w:r>
     </w:p>
     <w:p>
@@ -7244,7 +6990,7 @@
           <w:sz w:val="22"/>
           <w:szCs w:val="22"/>
         </w:rPr>
-        <w:t xml:space="preserve"> any self-propelled platform or device mounted on, integrated with, or operated from an automobile or truck chassis; or </w:t>
+        <w:t xml:space="preserve">any self-propelled platform or device mounted on, integrated with, or operated from an automobile or truck chassis; or </w:t>
       </w:r>
     </w:p>
     <w:p>
@@ -7276,7 +7022,7 @@
           <w:sz w:val="22"/>
           <w:szCs w:val="22"/>
         </w:rPr>
-        <w:t xml:space="preserve"> any autonomous or remotely operated ground device when operated on public roads or under a motor vehicle licensing or permitting scheme. </w:t>
+        <w:t xml:space="preserve">any autonomous or remotely operated ground device when operated on public roads or under a motor vehicle licensing or permitting scheme. </w:t>
       </w:r>
     </w:p>
     <w:p>
@@ -7400,7 +7146,7 @@
           <w:sz w:val="22"/>
           <w:szCs w:val="22"/>
         </w:rPr>
-        <w:t xml:space="preserve"> an </w:t>
+        <w:t xml:space="preserve">an </w:t>
       </w:r>
       <w:r>
         <w:rPr>
@@ -7452,7 +7198,7 @@
           <w:sz w:val="22"/>
           <w:szCs w:val="22"/>
         </w:rPr>
-        <w:t xml:space="preserve"> containers (other than vehicles), materials, parts or equipment furnished in connection with such goods or products. </w:t>
+        <w:t xml:space="preserve">containers (other than vehicles), materials, parts or equipment furnished in connection with such goods or products. </w:t>
       </w:r>
       <w:r>
         <w:rPr>
@@ -7587,7 +7333,7 @@
           <w:sz w:val="22"/>
           <w:szCs w:val="22"/>
         </w:rPr>
-        <w:t xml:space="preserve"> work or operations performed by you or on your behalf; and </w:t>
+        <w:t xml:space="preserve">work or operations performed by you or on your behalf; and </w:t>
       </w:r>
     </w:p>
     <w:p>
@@ -7619,7 +7365,7 @@
           <w:sz w:val="22"/>
           <w:szCs w:val="22"/>
         </w:rPr>
-        <w:t xml:space="preserve"> materials, parts or equipment furnished in connection with such work or operations. </w:t>
+        <w:t xml:space="preserve">materials, parts or equipment furnished in connection with such work or operations. </w:t>
       </w:r>
       <w:r>
         <w:rPr>
@@ -7751,7 +7497,7 @@
           <w:sz w:val="22"/>
           <w:szCs w:val="22"/>
         </w:rPr>
-        <w:t xml:space="preserve"> Limits of Liability </w:t>
+        <w:t xml:space="preserve">Limits of Liability </w:t>
       </w:r>
     </w:p>
     <w:p>
@@ -7780,15 +7526,6 @@
       </w:pPr>
       <w:r>
         <w:rPr>
-          <w:rFonts w:ascii="Inter" w:hAnsi="Inter" w:eastAsia="Inter" w:cs="Inter"/>
-          <w:color w:val="000000"/>
-          <w:sz w:val="22"/>
-          <w:szCs w:val="22"/>
-        </w:rPr>
-        <w:t xml:space="preserve"> </w:t>
-      </w:r>
-      <w:r>
-        <w:rPr>
           <w:b/>
           <w:bCs/>
           <w:rFonts w:ascii="Inter" w:hAnsi="Inter" w:eastAsia="Inter" w:cs="Inter"/>
@@ -7988,7 +7725,7 @@
           <w:sz w:val="22"/>
           <w:szCs w:val="22"/>
         </w:rPr>
-        <w:t xml:space="preserve"> If the limits of liability for any provision of this CGL Policy are exhausted by payment of </w:t>
+        <w:t xml:space="preserve">If the limits of liability for any provision of this CGL Policy are exhausted by payment of </w:t>
       </w:r>
       <w:r>
         <w:rPr>
@@ -8090,7 +7827,7 @@
           <w:sz w:val="22"/>
           <w:szCs w:val="22"/>
         </w:rPr>
-        <w:t xml:space="preserve"> The amount listed as the Per </w:t>
+        <w:t xml:space="preserve">The amount listed as the Per </w:t>
       </w:r>
       <w:r>
         <w:rPr>
@@ -8242,7 +7979,7 @@
           <w:sz w:val="22"/>
           <w:szCs w:val="22"/>
         </w:rPr>
-        <w:t xml:space="preserve"> Our liability under this CGL Policy with respect to all </w:t>
+        <w:t xml:space="preserve">Our liability under this CGL Policy with respect to all </w:t>
       </w:r>
       <w:r>
         <w:rPr>
@@ -8409,15 +8146,6 @@
       </w:pPr>
       <w:r>
         <w:rPr>
-          <w:rFonts w:ascii="Inter" w:hAnsi="Inter" w:eastAsia="Inter" w:cs="Inter"/>
-          <w:color w:val="000000"/>
-          <w:sz w:val="22"/>
-          <w:szCs w:val="22"/>
-        </w:rPr>
-        <w:t xml:space="preserve"> </w:t>
-      </w:r>
-      <w:r>
-        <w:rPr>
           <w:b/>
           <w:bCs/>
           <w:rFonts w:ascii="Inter" w:hAnsi="Inter" w:eastAsia="Inter" w:cs="Inter"/>
@@ -8590,15 +8318,6 @@
       </w:pPr>
       <w:r>
         <w:rPr>
-          <w:rFonts w:ascii="Inter" w:hAnsi="Inter" w:eastAsia="Inter" w:cs="Inter"/>
-          <w:color w:val="000000"/>
-          <w:sz w:val="22"/>
-          <w:szCs w:val="22"/>
-        </w:rPr>
-        <w:t xml:space="preserve"> </w:t>
-      </w:r>
-      <w:r>
-        <w:rPr>
           <w:b/>
           <w:bCs/>
           <w:rFonts w:ascii="Inter" w:hAnsi="Inter" w:eastAsia="Inter" w:cs="Inter"/>
@@ -8766,15 +8485,6 @@
       </w:pPr>
       <w:r>
         <w:rPr>
-          <w:rFonts w:ascii="Inter" w:hAnsi="Inter" w:eastAsia="Inter" w:cs="Inter"/>
-          <w:color w:val="000000"/>
-          <w:sz w:val="22"/>
-          <w:szCs w:val="22"/>
-        </w:rPr>
-        <w:t xml:space="preserve"> </w:t>
-      </w:r>
-      <w:r>
-        <w:rPr>
           <w:b/>
           <w:bCs/>
           <w:rFonts w:ascii="Inter" w:hAnsi="Inter" w:eastAsia="Inter" w:cs="Inter"/>
@@ -8843,7 +8553,7 @@
           <w:sz w:val="22"/>
           <w:szCs w:val="22"/>
         </w:rPr>
-        <w:t xml:space="preserve"> The </w:t>
+        <w:t xml:space="preserve">The </w:t>
       </w:r>
       <w:r>
         <w:rPr>
@@ -8988,17 +8698,6 @@
           <w:sz w:val="22"/>
           <w:szCs w:val="22"/>
         </w:rPr>
-        <w:t xml:space="preserve"> </w:t>
-      </w:r>
-      <w:r>
-        <w:rPr>
-          <w:b/>
-          <w:bCs/>
-          <w:rFonts w:ascii="Inter" w:hAnsi="Inter" w:eastAsia="Inter" w:cs="Inter"/>
-          <w:color w:val="000000"/>
-          <w:sz w:val="22"/>
-          <w:szCs w:val="22"/>
-        </w:rPr>
         <w:t xml:space="preserve">Retention </w:t>
       </w:r>
     </w:p>
@@ -9872,17 +9571,6 @@
           <w:sz w:val="22"/>
           <w:szCs w:val="22"/>
         </w:rPr>
-        <w:t xml:space="preserve"> </w:t>
-      </w:r>
-      <w:r>
-        <w:rPr>
-          <w:b/>
-          <w:bCs/>
-          <w:rFonts w:ascii="Inter" w:hAnsi="Inter" w:eastAsia="Inter" w:cs="Inter"/>
-          <w:color w:val="000000"/>
-          <w:sz w:val="22"/>
-          <w:szCs w:val="22"/>
-        </w:rPr>
         <w:t xml:space="preserve">Exclusions Applicable to All Coverages (Coverage A, B, and C): </w:t>
       </w:r>
     </w:p>
@@ -10019,15 +9707,6 @@
       </w:pPr>
       <w:r>
         <w:rPr>
-          <w:rFonts w:ascii="Inter" w:hAnsi="Inter" w:eastAsia="Inter" w:cs="Inter"/>
-          <w:color w:val="000000"/>
-          <w:sz w:val="22"/>
-          <w:szCs w:val="22"/>
-        </w:rPr>
-        <w:t xml:space="preserve"> </w:t>
-      </w:r>
-      <w:r>
-        <w:rPr>
           <w:b/>
           <w:bCs/>
           <w:rFonts w:ascii="Inter" w:hAnsi="Inter" w:eastAsia="Inter" w:cs="Inter"/>
@@ -10178,7 +9857,7 @@
           <w:sz w:val="22"/>
           <w:szCs w:val="22"/>
         </w:rPr>
-        <w:t xml:space="preserve"> the </w:t>
+        <w:t xml:space="preserve">the </w:t>
       </w:r>
       <w:r>
         <w:rPr>
@@ -10314,15 +9993,6 @@
       </w:pPr>
       <w:r>
         <w:rPr>
-          <w:rFonts w:ascii="Inter" w:hAnsi="Inter" w:eastAsia="Inter" w:cs="Inter"/>
-          <w:color w:val="000000"/>
-          <w:sz w:val="22"/>
-          <w:szCs w:val="22"/>
-        </w:rPr>
-        <w:t xml:space="preserve"> </w:t>
-      </w:r>
-      <w:r>
-        <w:rPr>
           <w:b/>
           <w:bCs/>
           <w:rFonts w:ascii="Inter" w:hAnsi="Inter" w:eastAsia="Inter" w:cs="Inter"/>
@@ -10415,15 +10085,6 @@
         </w:numPr>
       </w:pPr>
       <w:proofErr w:type="spellStart"/>
-      <w:r>
-        <w:rPr>
-          <w:rFonts w:ascii="Inter" w:hAnsi="Inter" w:eastAsia="Inter" w:cs="Inter"/>
-          <w:color w:val="000000"/>
-          <w:sz w:val="22"/>
-          <w:szCs w:val="22"/>
-        </w:rPr>
-        <w:t/>
-      </w:r>
       <w:proofErr w:type="spellEnd"/>
       <w:r>
         <w:rPr>
@@ -10432,7 +10093,7 @@
           <w:sz w:val="22"/>
           <w:szCs w:val="22"/>
         </w:rPr>
-        <w:t xml:space="preserve"> when such </w:t>
+        <w:t xml:space="preserve">when such </w:t>
       </w:r>
       <w:r>
         <w:rPr>
@@ -10504,7 +10165,7 @@
           <w:sz w:val="22"/>
           <w:szCs w:val="22"/>
         </w:rPr>
-        <w:t xml:space="preserve"> the </w:t>
+        <w:t xml:space="preserve">the </w:t>
       </w:r>
       <w:r>
         <w:rPr>
@@ -10576,7 +10237,7 @@
           <w:sz w:val="22"/>
           <w:szCs w:val="22"/>
         </w:rPr>
-        <w:t xml:space="preserve"> after such </w:t>
+        <w:t xml:space="preserve">after such </w:t>
       </w:r>
       <w:r>
         <w:rPr>
@@ -10650,17 +10311,6 @@
           <w:sz w:val="22"/>
           <w:szCs w:val="22"/>
         </w:rPr>
-        <w:t xml:space="preserve"> </w:t>
-      </w:r>
-      <w:r>
-        <w:rPr>
-          <w:b/>
-          <w:bCs/>
-          <w:rFonts w:ascii="Inter" w:hAnsi="Inter" w:eastAsia="Inter" w:cs="Inter"/>
-          <w:color w:val="000000"/>
-          <w:sz w:val="22"/>
-          <w:szCs w:val="22"/>
-        </w:rPr>
         <w:t xml:space="preserve">Prior or Pending Proceedings: </w:t>
       </w:r>
       <w:r>
@@ -10744,17 +10394,6 @@
           <w:sz w:val="22"/>
           <w:szCs w:val="22"/>
         </w:rPr>
-        <w:t xml:space="preserve"> </w:t>
-      </w:r>
-      <w:r>
-        <w:rPr>
-          <w:b/>
-          <w:bCs/>
-          <w:rFonts w:ascii="Inter" w:hAnsi="Inter" w:eastAsia="Inter" w:cs="Inter"/>
-          <w:color w:val="000000"/>
-          <w:sz w:val="22"/>
-          <w:szCs w:val="22"/>
-        </w:rPr>
         <w:t xml:space="preserve">Electronic Data: </w:t>
       </w:r>
       <w:r>
@@ -10798,17 +10437,6 @@
           <w:sz w:val="22"/>
           <w:szCs w:val="22"/>
         </w:rPr>
-        <w:t xml:space="preserve"> </w:t>
-      </w:r>
-      <w:r>
-        <w:rPr>
-          <w:b/>
-          <w:bCs/>
-          <w:rFonts w:ascii="Inter" w:hAnsi="Inter" w:eastAsia="Inter" w:cs="Inter"/>
-          <w:color w:val="000000"/>
-          <w:sz w:val="22"/>
-          <w:szCs w:val="22"/>
-        </w:rPr>
         <w:t xml:space="preserve">Asbestos and Lead: </w:t>
       </w:r>
       <w:r>
@@ -10872,17 +10500,6 @@
           <w:sz w:val="22"/>
           <w:szCs w:val="22"/>
         </w:rPr>
-        <w:t xml:space="preserve"> </w:t>
-      </w:r>
-      <w:r>
-        <w:rPr>
-          <w:b/>
-          <w:bCs/>
-          <w:rFonts w:ascii="Inter" w:hAnsi="Inter" w:eastAsia="Inter" w:cs="Inter"/>
-          <w:color w:val="000000"/>
-          <w:sz w:val="22"/>
-          <w:szCs w:val="22"/>
-        </w:rPr>
         <w:t xml:space="preserve">Workers’ Compensation: </w:t>
       </w:r>
       <w:r>
@@ -10946,17 +10563,6 @@
           <w:sz w:val="22"/>
           <w:szCs w:val="22"/>
         </w:rPr>
-        <w:t xml:space="preserve"> </w:t>
-      </w:r>
-      <w:r>
-        <w:rPr>
-          <w:b/>
-          <w:bCs/>
-          <w:rFonts w:ascii="Inter" w:hAnsi="Inter" w:eastAsia="Inter" w:cs="Inter"/>
-          <w:color w:val="000000"/>
-          <w:sz w:val="22"/>
-          <w:szCs w:val="22"/>
-        </w:rPr>
         <w:t xml:space="preserve">Employer’s Liability: </w:t>
       </w:r>
       <w:r>
@@ -11038,7 +10644,7 @@
           <w:sz w:val="22"/>
           <w:szCs w:val="22"/>
         </w:rPr>
-        <w:t xml:space="preserve"> an </w:t>
+        <w:t xml:space="preserve">an </w:t>
       </w:r>
       <w:r>
         <w:rPr>
@@ -11150,7 +10756,7 @@
           <w:sz w:val="22"/>
           <w:szCs w:val="22"/>
         </w:rPr>
-        <w:t xml:space="preserve"> the spouse, child, parent, brother or sister of that </w:t>
+        <w:t xml:space="preserve">the spouse, child, parent, brother or sister of that </w:t>
       </w:r>
       <w:r>
         <w:rPr>
@@ -11264,17 +10870,6 @@
           <w:sz w:val="22"/>
           <w:szCs w:val="22"/>
         </w:rPr>
-        <w:t xml:space="preserve"> </w:t>
-      </w:r>
-      <w:r>
-        <w:rPr>
-          <w:b/>
-          <w:bCs/>
-          <w:rFonts w:ascii="Inter" w:hAnsi="Inter" w:eastAsia="Inter" w:cs="Inter"/>
-          <w:color w:val="000000"/>
-          <w:sz w:val="22"/>
-          <w:szCs w:val="22"/>
-        </w:rPr>
         <w:t xml:space="preserve">Professional Services: </w:t>
       </w:r>
       <w:r>
@@ -11338,17 +10933,6 @@
           <w:sz w:val="22"/>
           <w:szCs w:val="22"/>
         </w:rPr>
-        <w:t xml:space="preserve"> </w:t>
-      </w:r>
-      <w:r>
-        <w:rPr>
-          <w:b/>
-          <w:bCs/>
-          <w:rFonts w:ascii="Inter" w:hAnsi="Inter" w:eastAsia="Inter" w:cs="Inter"/>
-          <w:color w:val="000000"/>
-          <w:sz w:val="22"/>
-          <w:szCs w:val="22"/>
-        </w:rPr>
         <w:t xml:space="preserve">Contractual Liability: </w:t>
       </w:r>
       <w:r>
@@ -11462,17 +11046,6 @@
           <w:sz w:val="22"/>
           <w:szCs w:val="22"/>
         </w:rPr>
-        <w:t xml:space="preserve"> </w:t>
-      </w:r>
-      <w:r>
-        <w:rPr>
-          <w:b/>
-          <w:bCs/>
-          <w:rFonts w:ascii="Inter" w:hAnsi="Inter" w:eastAsia="Inter" w:cs="Inter"/>
-          <w:color w:val="000000"/>
-          <w:sz w:val="22"/>
-          <w:szCs w:val="22"/>
-        </w:rPr>
         <w:t xml:space="preserve">Employment-Related Practices: </w:t>
       </w:r>
       <w:r>
@@ -11514,7 +11087,7 @@
           <w:sz w:val="22"/>
           <w:szCs w:val="22"/>
         </w:rPr>
-        <w:t xml:space="preserve"> any employment-related practice, policy, act or omission (such as coercion, demotion, evaluation, reassignment, discipline, defamation, harassment, humiliation, discrimination, termination, or malicious prosecution, or inappropriate employment hiring or promotion decisions); or </w:t>
+        <w:t xml:space="preserve">any employment-related practice, policy, act or omission (such as coercion, demotion, evaluation, reassignment, discipline, defamation, harassment, humiliation, discrimination, termination, or malicious prosecution, or inappropriate employment hiring or promotion decisions); or </w:t>
       </w:r>
     </w:p>
     <w:p>
@@ -11546,7 +11119,7 @@
           <w:sz w:val="22"/>
           <w:szCs w:val="22"/>
         </w:rPr>
-        <w:t xml:space="preserve"> the spouse, child, parent, brother, sister or other relative of that person </w:t>
+        <w:t xml:space="preserve">the spouse, child, parent, brother, sister or other relative of that person </w:t>
       </w:r>
       <w:proofErr w:type="gramStart"/>
       <w:r>
@@ -11649,17 +11222,6 @@
           <w:sz w:val="22"/>
           <w:szCs w:val="22"/>
         </w:rPr>
-        <w:t xml:space="preserve"> </w:t>
-      </w:r>
-      <w:r>
-        <w:rPr>
-          <w:b/>
-          <w:bCs/>
-          <w:rFonts w:ascii="Inter" w:hAnsi="Inter" w:eastAsia="Inter" w:cs="Inter"/>
-          <w:color w:val="000000"/>
-          <w:sz w:val="22"/>
-          <w:szCs w:val="22"/>
-        </w:rPr>
         <w:t xml:space="preserve">Fraud and Intentional Acts: </w:t>
       </w:r>
       <w:r>
@@ -11823,17 +11385,6 @@
           <w:sz w:val="22"/>
           <w:szCs w:val="22"/>
         </w:rPr>
-        <w:t xml:space="preserve"> </w:t>
-      </w:r>
-      <w:r>
-        <w:rPr>
-          <w:b/>
-          <w:bCs/>
-          <w:rFonts w:ascii="Inter" w:hAnsi="Inter" w:eastAsia="Inter" w:cs="Inter"/>
-          <w:color w:val="000000"/>
-          <w:sz w:val="22"/>
-          <w:szCs w:val="22"/>
-        </w:rPr>
         <w:t xml:space="preserve">Medicare/Medicaid: </w:t>
       </w:r>
       <w:r>
@@ -11877,17 +11428,6 @@
           <w:sz w:val="22"/>
           <w:szCs w:val="22"/>
         </w:rPr>
-        <w:t xml:space="preserve"> </w:t>
-      </w:r>
-      <w:r>
-        <w:rPr>
-          <w:b/>
-          <w:bCs/>
-          <w:rFonts w:ascii="Inter" w:hAnsi="Inter" w:eastAsia="Inter" w:cs="Inter"/>
-          <w:color w:val="000000"/>
-          <w:sz w:val="22"/>
-          <w:szCs w:val="22"/>
-        </w:rPr>
         <w:t xml:space="preserve">Illegal Profit: </w:t>
       </w:r>
       <w:r>
@@ -11951,17 +11491,6 @@
           <w:sz w:val="22"/>
           <w:szCs w:val="22"/>
         </w:rPr>
-        <w:t xml:space="preserve"> </w:t>
-      </w:r>
-      <w:r>
-        <w:rPr>
-          <w:b/>
-          <w:bCs/>
-          <w:rFonts w:ascii="Inter" w:hAnsi="Inter" w:eastAsia="Inter" w:cs="Inter"/>
-          <w:color w:val="000000"/>
-          <w:sz w:val="22"/>
-          <w:szCs w:val="22"/>
-        </w:rPr>
         <w:t xml:space="preserve">Business Dispute: </w:t>
       </w:r>
       <w:r>
@@ -12005,17 +11534,6 @@
           <w:sz w:val="22"/>
           <w:szCs w:val="22"/>
         </w:rPr>
-        <w:t xml:space="preserve"> </w:t>
-      </w:r>
-      <w:r>
-        <w:rPr>
-          <w:b/>
-          <w:bCs/>
-          <w:rFonts w:ascii="Inter" w:hAnsi="Inter" w:eastAsia="Inter" w:cs="Inter"/>
-          <w:color w:val="000000"/>
-          <w:sz w:val="22"/>
-          <w:szCs w:val="22"/>
-        </w:rPr>
         <w:t xml:space="preserve">Cyber Liability: </w:t>
       </w:r>
       <w:r>
@@ -12098,17 +11616,6 @@
           <w:sz w:val="22"/>
           <w:szCs w:val="22"/>
         </w:rPr>
-        <w:t xml:space="preserve"> </w:t>
-      </w:r>
-      <w:r>
-        <w:rPr>
-          <w:b/>
-          <w:bCs/>
-          <w:rFonts w:ascii="Inter" w:hAnsi="Inter" w:eastAsia="Inter" w:cs="Inter"/>
-          <w:color w:val="000000"/>
-          <w:sz w:val="22"/>
-          <w:szCs w:val="22"/>
-        </w:rPr>
         <w:t xml:space="preserve">Record Amendments: </w:t>
       </w:r>
       <w:r>
@@ -12212,17 +11719,6 @@
           <w:sz w:val="22"/>
           <w:szCs w:val="22"/>
         </w:rPr>
-        <w:t xml:space="preserve"> </w:t>
-      </w:r>
-      <w:r>
-        <w:rPr>
-          <w:b/>
-          <w:bCs/>
-          <w:rFonts w:ascii="Inter" w:hAnsi="Inter" w:eastAsia="Inter" w:cs="Inter"/>
-          <w:color w:val="000000"/>
-          <w:sz w:val="22"/>
-          <w:szCs w:val="22"/>
-        </w:rPr>
         <w:t xml:space="preserve">Discrimination: </w:t>
       </w:r>
       <w:r>
@@ -12266,17 +11762,6 @@
           <w:sz w:val="22"/>
           <w:szCs w:val="22"/>
         </w:rPr>
-        <w:t xml:space="preserve"> </w:t>
-      </w:r>
-      <w:r>
-        <w:rPr>
-          <w:b/>
-          <w:bCs/>
-          <w:rFonts w:ascii="Inter" w:hAnsi="Inter" w:eastAsia="Inter" w:cs="Inter"/>
-          <w:color w:val="000000"/>
-          <w:sz w:val="22"/>
-          <w:szCs w:val="22"/>
-        </w:rPr>
         <w:t xml:space="preserve">Weapons: </w:t>
       </w:r>
       <w:r>
@@ -12320,17 +11805,6 @@
           <w:sz w:val="22"/>
           <w:szCs w:val="22"/>
         </w:rPr>
-        <w:t xml:space="preserve"> </w:t>
-      </w:r>
-      <w:r>
-        <w:rPr>
-          <w:b/>
-          <w:bCs/>
-          <w:rFonts w:ascii="Inter" w:hAnsi="Inter" w:eastAsia="Inter" w:cs="Inter"/>
-          <w:color w:val="000000"/>
-          <w:sz w:val="22"/>
-          <w:szCs w:val="22"/>
-        </w:rPr>
         <w:t xml:space="preserve">Nuclear Liability: </w:t>
       </w:r>
       <w:r>
@@ -12374,17 +11848,6 @@
           <w:sz w:val="22"/>
           <w:szCs w:val="22"/>
         </w:rPr>
-        <w:t xml:space="preserve"> </w:t>
-      </w:r>
-      <w:r>
-        <w:rPr>
-          <w:b/>
-          <w:bCs/>
-          <w:rFonts w:ascii="Inter" w:hAnsi="Inter" w:eastAsia="Inter" w:cs="Inter"/>
-          <w:color w:val="000000"/>
-          <w:sz w:val="22"/>
-          <w:szCs w:val="22"/>
-        </w:rPr>
         <w:t xml:space="preserve">Liquor Liability: </w:t>
       </w:r>
       <w:r>
@@ -12446,7 +11909,7 @@
           <w:sz w:val="22"/>
           <w:szCs w:val="22"/>
         </w:rPr>
-        <w:t xml:space="preserve"> causing or contributing to the intoxication of any person; </w:t>
+        <w:t xml:space="preserve">causing or contributing to the intoxication of any person; </w:t>
       </w:r>
     </w:p>
     <w:p>
@@ -12478,7 +11941,7 @@
           <w:sz w:val="22"/>
           <w:szCs w:val="22"/>
         </w:rPr>
-        <w:t xml:space="preserve"> furnishing alcoholic beverages to a person under the legal drinking age or under the influence of alcohol; or </w:t>
+        <w:t xml:space="preserve">furnishing alcoholic beverages to a person under the legal drinking age or under the influence of alcohol; or </w:t>
       </w:r>
     </w:p>
     <w:p>
@@ -12510,7 +11973,7 @@
           <w:sz w:val="22"/>
           <w:szCs w:val="22"/>
         </w:rPr>
-        <w:t xml:space="preserve"> any statute, ordinance or regulation relating to the sale, gift, distribution or use of alcoholic beverages. </w:t>
+        <w:t xml:space="preserve">any statute, ordinance or regulation relating to the sale, gift, distribution or use of alcoholic beverages. </w:t>
       </w:r>
     </w:p>
     <w:p>
@@ -12653,17 +12116,6 @@
           <w:sz w:val="22"/>
           <w:szCs w:val="22"/>
         </w:rPr>
-        <w:t xml:space="preserve"> </w:t>
-      </w:r>
-      <w:r>
-        <w:rPr>
-          <w:b/>
-          <w:bCs/>
-          <w:rFonts w:ascii="Inter" w:hAnsi="Inter" w:eastAsia="Inter" w:cs="Inter"/>
-          <w:color w:val="000000"/>
-          <w:sz w:val="22"/>
-          <w:szCs w:val="22"/>
-        </w:rPr>
         <w:t xml:space="preserve">War: </w:t>
       </w:r>
       <w:r>
@@ -12707,17 +12159,6 @@
           <w:sz w:val="22"/>
           <w:szCs w:val="22"/>
         </w:rPr>
-        <w:t xml:space="preserve"> </w:t>
-      </w:r>
-      <w:r>
-        <w:rPr>
-          <w:b/>
-          <w:bCs/>
-          <w:rFonts w:ascii="Inter" w:hAnsi="Inter" w:eastAsia="Inter" w:cs="Inter"/>
-          <w:color w:val="000000"/>
-          <w:sz w:val="22"/>
-          <w:szCs w:val="22"/>
-        </w:rPr>
         <w:t xml:space="preserve">Pollution: </w:t>
       </w:r>
       <w:r>
@@ -12782,7 +12223,6 @@
           <w:szCs w:val="22"/>
         </w:rPr>
         <w:lastRenderedPageBreak/>
-        <w:t xml:space="preserve"> </w:t>
       </w:r>
       <w:r>
         <w:rPr>
@@ -12854,7 +12294,7 @@
           <w:sz w:val="22"/>
           <w:szCs w:val="22"/>
         </w:rPr>
-        <w:t xml:space="preserve"> the Telephone Consumer Protection Act (TCPA), including any amendment or addition to such law; </w:t>
+        <w:t xml:space="preserve">the Telephone Consumer Protection Act (TCPA), including any amendment or addition to such law; </w:t>
       </w:r>
     </w:p>
     <w:p>
@@ -12886,7 +12326,7 @@
           <w:sz w:val="22"/>
           <w:szCs w:val="22"/>
         </w:rPr>
-        <w:t xml:space="preserve"> the CAN-SPAM Act of 2003 (Controlling the Assault of Non-Solicited Pornography and Marketing), including any amendment or addition to such law; </w:t>
+        <w:t xml:space="preserve">the CAN-SPAM Act of 2003 (Controlling the Assault of Non-Solicited Pornography and Marketing), including any amendment or addition to such law; </w:t>
       </w:r>
     </w:p>
     <w:p>
@@ -12918,7 +12358,7 @@
           <w:sz w:val="22"/>
           <w:szCs w:val="22"/>
         </w:rPr>
-        <w:t xml:space="preserve"> the Fair Credit Reporting Act (FCRA) and any Fair and Accurate Credit Transactions Act (FACTA) amendment, including any amendment or addition to such law; or </w:t>
+        <w:t xml:space="preserve">the Fair Credit Reporting Act (FCRA) and any Fair and Accurate Credit Transactions Act (FACTA) amendment, including any amendment or addition to such law; or </w:t>
       </w:r>
     </w:p>
     <w:p>
@@ -12950,7 +12390,7 @@
           <w:sz w:val="22"/>
           <w:szCs w:val="22"/>
         </w:rPr>
-        <w:t xml:space="preserve"> any federal, state or local statute, ordinance or regulation (other than the U.S. antitrust laws and federal securities laws, which are addressed elsewhere if applicable) that addresses, prohibits or limits the printing, dissemination, disposal, collecting, recording, sending, transmitting, communicating or distribution of material or information. </w:t>
+        <w:t xml:space="preserve">any federal, state or local statute, ordinance or regulation (other than the U.S. antitrust laws and federal securities laws, which are addressed elsewhere if applicable) that addresses, prohibits or limits the printing, dissemination, disposal, collecting, recording, sending, transmitting, communicating or distribution of material or information. </w:t>
       </w:r>
     </w:p>
     <w:p>
@@ -12988,7 +12428,7 @@
           <w:sz w:val="22"/>
           <w:szCs w:val="22"/>
         </w:rPr>
-        <w:t xml:space="preserve"> Exclusions Applicable to Coverage A and Coverage C: </w:t>
+        <w:t xml:space="preserve">Exclusions Applicable to Coverage A and Coverage C: </w:t>
       </w:r>
     </w:p>
     <w:p>
@@ -13124,15 +12564,6 @@
       </w:pPr>
       <w:r>
         <w:rPr>
-          <w:rFonts w:ascii="Inter" w:hAnsi="Inter" w:eastAsia="Inter" w:cs="Inter"/>
-          <w:color w:val="000000"/>
-          <w:sz w:val="22"/>
-          <w:szCs w:val="22"/>
-        </w:rPr>
-        <w:t xml:space="preserve"> </w:t>
-      </w:r>
-      <w:r>
-        <w:rPr>
           <w:b/>
           <w:bCs/>
           <w:rFonts w:ascii="Inter" w:hAnsi="Inter" w:eastAsia="Inter" w:cs="Inter"/>
@@ -13258,15 +12689,6 @@
       </w:pPr>
       <w:r>
         <w:rPr>
-          <w:rFonts w:ascii="Inter" w:hAnsi="Inter" w:eastAsia="Inter" w:cs="Inter"/>
-          <w:color w:val="000000"/>
-          <w:sz w:val="22"/>
-          <w:szCs w:val="22"/>
-        </w:rPr>
-        <w:t xml:space="preserve"> </w:t>
-      </w:r>
-      <w:r>
-        <w:rPr>
           <w:b/>
           <w:bCs/>
           <w:rFonts w:ascii="Inter" w:hAnsi="Inter" w:eastAsia="Inter" w:cs="Inter"/>
@@ -13535,7 +12957,7 @@
           <w:sz w:val="22"/>
           <w:szCs w:val="22"/>
         </w:rPr>
-        <w:t xml:space="preserve"> a watercraft while ashore on premises you own or rent; </w:t>
+        <w:t xml:space="preserve">a watercraft while ashore on premises you own or rent; </w:t>
       </w:r>
     </w:p>
     <w:p>
@@ -14062,15 +13484,6 @@
       </w:pPr>
       <w:r>
         <w:rPr>
-          <w:rFonts w:ascii="Inter" w:hAnsi="Inter" w:eastAsia="Inter" w:cs="Inter"/>
-          <w:color w:val="000000"/>
-          <w:sz w:val="22"/>
-          <w:szCs w:val="22"/>
-        </w:rPr>
-        <w:t xml:space="preserve"> </w:t>
-      </w:r>
-      <w:r>
-        <w:rPr>
           <w:b/>
           <w:bCs/>
           <w:rFonts w:ascii="Inter" w:hAnsi="Inter" w:eastAsia="Inter" w:cs="Inter"/>
@@ -14274,15 +13687,6 @@
       <w:proofErr w:type="spellEnd"/>
       <w:r>
         <w:rPr>
-          <w:rFonts w:ascii="Inter" w:hAnsi="Inter" w:eastAsia="Inter" w:cs="Inter"/>
-          <w:color w:val="000000"/>
-          <w:sz w:val="22"/>
-          <w:szCs w:val="22"/>
-        </w:rPr>
-        <w:t xml:space="preserve"> </w:t>
-      </w:r>
-      <w:r>
-        <w:rPr>
           <w:b/>
           <w:bCs/>
           <w:rFonts w:ascii="Inter" w:hAnsi="Inter" w:eastAsia="Inter" w:cs="Inter"/>
@@ -14966,15 +14370,6 @@
       </w:pPr>
       <w:r>
         <w:rPr>
-          <w:rFonts w:ascii="Inter" w:hAnsi="Inter" w:eastAsia="Inter" w:cs="Inter"/>
-          <w:color w:val="000000"/>
-          <w:sz w:val="22"/>
-          <w:szCs w:val="22"/>
-        </w:rPr>
-        <w:t xml:space="preserve"> </w:t>
-      </w:r>
-      <w:r>
-        <w:rPr>
           <w:b/>
           <w:bCs/>
           <w:rFonts w:ascii="Inter" w:hAnsi="Inter" w:eastAsia="Inter" w:cs="Inter"/>
@@ -15058,15 +14453,6 @@
       </w:pPr>
       <w:r>
         <w:rPr>
-          <w:rFonts w:ascii="Inter" w:hAnsi="Inter" w:eastAsia="Inter" w:cs="Inter"/>
-          <w:color w:val="000000"/>
-          <w:sz w:val="22"/>
-          <w:szCs w:val="22"/>
-        </w:rPr>
-        <w:t xml:space="preserve"> </w:t>
-      </w:r>
-      <w:r>
-        <w:rPr>
           <w:b/>
           <w:bCs/>
           <w:rFonts w:ascii="Inter" w:hAnsi="Inter" w:eastAsia="Inter" w:cs="Inter"/>
@@ -15152,15 +14538,6 @@
       <w:proofErr w:type="spellEnd"/>
       <w:r>
         <w:rPr>
-          <w:rFonts w:ascii="Inter" w:hAnsi="Inter" w:eastAsia="Inter" w:cs="Inter"/>
-          <w:color w:val="000000"/>
-          <w:sz w:val="22"/>
-          <w:szCs w:val="22"/>
-        </w:rPr>
-        <w:t xml:space="preserve"> </w:t>
-      </w:r>
-      <w:r>
-        <w:rPr>
           <w:b/>
           <w:bCs/>
           <w:rFonts w:ascii="Inter" w:hAnsi="Inter" w:eastAsia="Inter" w:cs="Inter"/>
@@ -15404,15 +14781,6 @@
       </w:pPr>
       <w:r>
         <w:rPr>
-          <w:rFonts w:ascii="Inter" w:hAnsi="Inter" w:eastAsia="Inter" w:cs="Inter"/>
-          <w:color w:val="000000"/>
-          <w:sz w:val="22"/>
-          <w:szCs w:val="22"/>
-        </w:rPr>
-        <w:t xml:space="preserve"> </w:t>
-      </w:r>
-      <w:r>
-        <w:rPr>
           <w:b/>
           <w:bCs/>
           <w:rFonts w:ascii="Inter" w:hAnsi="Inter" w:eastAsia="Inter" w:cs="Inter"/>
@@ -15458,15 +14826,6 @@
       <w:proofErr w:type="spellEnd"/>
       <w:r>
         <w:rPr>
-          <w:rFonts w:ascii="Inter" w:hAnsi="Inter" w:eastAsia="Inter" w:cs="Inter"/>
-          <w:color w:val="000000"/>
-          <w:sz w:val="22"/>
-          <w:szCs w:val="22"/>
-        </w:rPr>
-        <w:t xml:space="preserve"> </w:t>
-      </w:r>
-      <w:r>
-        <w:rPr>
           <w:b/>
           <w:bCs/>
           <w:rFonts w:ascii="Inter" w:hAnsi="Inter" w:eastAsia="Inter" w:cs="Inter"/>
@@ -15608,15 +14967,6 @@
       </w:pPr>
       <w:r>
         <w:rPr>
-          <w:rFonts w:ascii="Inter" w:hAnsi="Inter" w:eastAsia="Inter" w:cs="Inter"/>
-          <w:color w:val="000000"/>
-          <w:sz w:val="22"/>
-          <w:szCs w:val="22"/>
-        </w:rPr>
-        <w:t xml:space="preserve"> </w:t>
-      </w:r>
-      <w:r>
-        <w:rPr>
           <w:b/>
           <w:bCs/>
           <w:rFonts w:ascii="Inter" w:hAnsi="Inter" w:eastAsia="Inter" w:cs="Inter"/>
@@ -15711,7 +15061,7 @@
           <w:sz w:val="22"/>
           <w:szCs w:val="22"/>
         </w:rPr>
-        <w:t xml:space="preserve"> Exclusions Applicable to Coverage B — Personal and Advertising Injury Liability: </w:t>
+        <w:t xml:space="preserve">Exclusions Applicable to Coverage B — Personal and Advertising Injury Liability: </w:t>
       </w:r>
     </w:p>
     <w:p>
@@ -15827,15 +15177,6 @@
       </w:pPr>
       <w:r>
         <w:rPr>
-          <w:rFonts w:ascii="Inter" w:hAnsi="Inter" w:eastAsia="Inter" w:cs="Inter"/>
-          <w:color w:val="000000"/>
-          <w:sz w:val="22"/>
-          <w:szCs w:val="22"/>
-        </w:rPr>
-        <w:t xml:space="preserve"> </w:t>
-      </w:r>
-      <w:r>
-        <w:rPr>
           <w:b/>
           <w:bCs/>
           <w:rFonts w:ascii="Inter" w:hAnsi="Inter" w:eastAsia="Inter" w:cs="Inter"/>
@@ -15935,15 +15276,6 @@
       </w:pPr>
       <w:r>
         <w:rPr>
-          <w:rFonts w:ascii="Inter" w:hAnsi="Inter" w:eastAsia="Inter" w:cs="Inter"/>
-          <w:color w:val="000000"/>
-          <w:sz w:val="22"/>
-          <w:szCs w:val="22"/>
-        </w:rPr>
-        <w:t xml:space="preserve"> </w:t>
-      </w:r>
-      <w:r>
-        <w:rPr>
           <w:b/>
           <w:bCs/>
           <w:rFonts w:ascii="Inter" w:hAnsi="Inter" w:eastAsia="Inter" w:cs="Inter"/>
@@ -16007,15 +15339,6 @@
       </w:pPr>
       <w:r>
         <w:rPr>
-          <w:rFonts w:ascii="Inter" w:hAnsi="Inter" w:eastAsia="Inter" w:cs="Inter"/>
-          <w:color w:val="000000"/>
-          <w:sz w:val="22"/>
-          <w:szCs w:val="22"/>
-        </w:rPr>
-        <w:t xml:space="preserve"> </w:t>
-      </w:r>
-      <w:r>
-        <w:rPr>
           <w:b/>
           <w:bCs/>
           <w:rFonts w:ascii="Inter" w:hAnsi="Inter" w:eastAsia="Inter" w:cs="Inter"/>
@@ -16079,15 +15402,6 @@
       </w:pPr>
       <w:r>
         <w:rPr>
-          <w:rFonts w:ascii="Inter" w:hAnsi="Inter" w:eastAsia="Inter" w:cs="Inter"/>
-          <w:color w:val="000000"/>
-          <w:sz w:val="22"/>
-          <w:szCs w:val="22"/>
-        </w:rPr>
-        <w:t xml:space="preserve"> </w:t>
-      </w:r>
-      <w:r>
-        <w:rPr>
           <w:b/>
           <w:bCs/>
           <w:rFonts w:ascii="Inter" w:hAnsi="Inter" w:eastAsia="Inter" w:cs="Inter"/>
@@ -16151,15 +15465,6 @@
       </w:pPr>
       <w:r>
         <w:rPr>
-          <w:rFonts w:ascii="Inter" w:hAnsi="Inter" w:eastAsia="Inter" w:cs="Inter"/>
-          <w:color w:val="000000"/>
-          <w:sz w:val="22"/>
-          <w:szCs w:val="22"/>
-        </w:rPr>
-        <w:t xml:space="preserve"> </w:t>
-      </w:r>
-      <w:r>
-        <w:rPr>
           <w:b/>
           <w:bCs/>
           <w:rFonts w:ascii="Inter" w:hAnsi="Inter" w:eastAsia="Inter" w:cs="Inter"/>
@@ -16243,15 +15548,6 @@
       </w:pPr>
       <w:r>
         <w:rPr>
-          <w:rFonts w:ascii="Inter" w:hAnsi="Inter" w:eastAsia="Inter" w:cs="Inter"/>
-          <w:color w:val="000000"/>
-          <w:sz w:val="22"/>
-          <w:szCs w:val="22"/>
-        </w:rPr>
-        <w:t xml:space="preserve"> </w:t>
-      </w:r>
-      <w:r>
-        <w:rPr>
           <w:b/>
           <w:bCs/>
           <w:rFonts w:ascii="Inter" w:hAnsi="Inter" w:eastAsia="Inter" w:cs="Inter"/>
@@ -16486,15 +15782,6 @@
       </w:pPr>
       <w:r>
         <w:rPr>
-          <w:rFonts w:ascii="Inter" w:hAnsi="Inter" w:eastAsia="Inter" w:cs="Inter"/>
-          <w:color w:val="000000"/>
-          <w:sz w:val="22"/>
-          <w:szCs w:val="22"/>
-        </w:rPr>
-        <w:t xml:space="preserve"> </w:t>
-      </w:r>
-      <w:r>
-        <w:rPr>
           <w:b/>
           <w:bCs/>
           <w:rFonts w:ascii="Inter" w:hAnsi="Inter" w:eastAsia="Inter" w:cs="Inter"/>
@@ -16558,15 +15845,6 @@
       </w:pPr>
       <w:r>
         <w:rPr>
-          <w:rFonts w:ascii="Inter" w:hAnsi="Inter" w:eastAsia="Inter" w:cs="Inter"/>
-          <w:color w:val="000000"/>
-          <w:sz w:val="22"/>
-          <w:szCs w:val="22"/>
-        </w:rPr>
-        <w:t xml:space="preserve"> </w:t>
-      </w:r>
-      <w:r>
-        <w:rPr>
           <w:b/>
           <w:bCs/>
           <w:rFonts w:ascii="Inter" w:hAnsi="Inter" w:eastAsia="Inter" w:cs="Inter"/>
@@ -16631,7 +15909,7 @@
           <w:sz w:val="22"/>
           <w:szCs w:val="22"/>
         </w:rPr>
-        <w:t xml:space="preserve"> Exclusions Applicable to Coverage C — Medical Expenses Liability: </w:t>
+        <w:t xml:space="preserve">Exclusions Applicable to Coverage C — Medical Expenses Liability: </w:t>
       </w:r>
     </w:p>
     <w:p>
@@ -16707,15 +15985,6 @@
       </w:pPr>
       <w:r>
         <w:rPr>
-          <w:rFonts w:ascii="Inter" w:hAnsi="Inter" w:eastAsia="Inter" w:cs="Inter"/>
-          <w:color w:val="000000"/>
-          <w:sz w:val="22"/>
-          <w:szCs w:val="22"/>
-        </w:rPr>
-        <w:t xml:space="preserve"> </w:t>
-      </w:r>
-      <w:r>
-        <w:rPr>
           <w:b/>
           <w:bCs/>
           <w:rFonts w:ascii="Inter" w:hAnsi="Inter" w:eastAsia="Inter" w:cs="Inter"/>
@@ -16866,17 +16135,6 @@
       </w:pPr>
       <w:r>
         <w:rPr>
-          <w:b/>
-          <w:bCs/>
-          <w:rFonts w:ascii="Inter" w:hAnsi="Inter" w:eastAsia="Inter" w:cs="Inter"/>
-          <w:color w:val="000000"/>
-          <w:sz w:val="22"/>
-          <w:szCs w:val="22"/>
-        </w:rPr>
-        <w:t xml:space="preserve"> </w:t>
-      </w:r>
-      <w:r>
-        <w:rPr>
           <w:rFonts w:ascii="Inter" w:hAnsi="Inter" w:eastAsia="Inter" w:cs="Inter"/>
           <w:color w:val="000000"/>
           <w:sz w:val="22"/>
@@ -17058,17 +16316,6 @@
       </w:pPr>
       <w:r>
         <w:rPr>
-          <w:b/>
-          <w:bCs/>
-          <w:rFonts w:ascii="Inter" w:hAnsi="Inter" w:eastAsia="Inter" w:cs="Inter"/>
-          <w:color w:val="000000"/>
-          <w:sz w:val="22"/>
-          <w:szCs w:val="22"/>
-        </w:rPr>
-        <w:t xml:space="preserve"> </w:t>
-      </w:r>
-      <w:r>
-        <w:rPr>
           <w:rFonts w:ascii="Inter" w:hAnsi="Inter" w:eastAsia="Inter" w:cs="Inter"/>
           <w:color w:val="000000"/>
           <w:sz w:val="22"/>
@@ -17201,17 +16448,6 @@
       </w:pPr>
       <w:r>
         <w:rPr>
-          <w:b/>
-          <w:bCs/>
-          <w:rFonts w:ascii="Inter" w:hAnsi="Inter" w:eastAsia="Inter" w:cs="Inter"/>
-          <w:color w:val="000000"/>
-          <w:sz w:val="22"/>
-          <w:szCs w:val="22"/>
-        </w:rPr>
-        <w:t xml:space="preserve"> </w:t>
-      </w:r>
-      <w:r>
-        <w:rPr>
           <w:rFonts w:ascii="Inter" w:hAnsi="Inter" w:eastAsia="Inter" w:cs="Inter"/>
           <w:color w:val="000000"/>
           <w:sz w:val="22"/>
@@ -17643,17 +16879,6 @@
       </w:pPr>
       <w:r>
         <w:rPr>
-          <w:b/>
-          <w:bCs/>
-          <w:rFonts w:ascii="Inter" w:hAnsi="Inter" w:eastAsia="Inter" w:cs="Inter"/>
-          <w:color w:val="000000"/>
-          <w:sz w:val="22"/>
-          <w:szCs w:val="22"/>
-        </w:rPr>
-        <w:t xml:space="preserve"> </w:t>
-      </w:r>
-      <w:r>
-        <w:rPr>
           <w:rFonts w:ascii="Inter" w:hAnsi="Inter" w:eastAsia="Inter" w:cs="Inter"/>
           <w:color w:val="000000"/>
           <w:sz w:val="22"/>
@@ -17826,17 +17051,6 @@
       </w:pPr>
       <w:r>
         <w:rPr>
-          <w:b/>
-          <w:bCs/>
-          <w:rFonts w:ascii="Inter" w:hAnsi="Inter" w:eastAsia="Inter" w:cs="Inter"/>
-          <w:color w:val="000000"/>
-          <w:sz w:val="22"/>
-          <w:szCs w:val="22"/>
-        </w:rPr>
-        <w:t xml:space="preserve"> </w:t>
-      </w:r>
-      <w:r>
-        <w:rPr>
           <w:rFonts w:ascii="Inter" w:hAnsi="Inter" w:eastAsia="Inter" w:cs="Inter"/>
           <w:color w:val="000000"/>
           <w:sz w:val="22"/>
@@ -17963,17 +17177,6 @@
           <w:sz w:val="22"/>
           <w:szCs w:val="22"/>
         </w:rPr>
-        <w:t xml:space="preserve"> </w:t>
-      </w:r>
-      <w:r>
-        <w:rPr>
-          <w:b/>
-          <w:bCs/>
-          <w:rFonts w:ascii="Inter" w:hAnsi="Inter" w:eastAsia="Inter" w:cs="Inter"/>
-          <w:color w:val="000000"/>
-          <w:sz w:val="22"/>
-          <w:szCs w:val="22"/>
-        </w:rPr>
         <w:t xml:space="preserve">Change in Control: </w:t>
       </w:r>
       <w:r>
@@ -18197,17 +17400,6 @@
           <w:sz w:val="22"/>
           <w:szCs w:val="22"/>
         </w:rPr>
-        <w:t xml:space="preserve"> </w:t>
-      </w:r>
-      <w:r>
-        <w:rPr>
-          <w:b/>
-          <w:bCs/>
-          <w:rFonts w:ascii="Inter" w:hAnsi="Inter" w:eastAsia="Inter" w:cs="Inter"/>
-          <w:color w:val="000000"/>
-          <w:sz w:val="22"/>
-          <w:szCs w:val="22"/>
-        </w:rPr>
         <w:t xml:space="preserve">Bankruptcy: </w:t>
       </w:r>
       <w:r>
@@ -18510,7 +17702,7 @@
           <w:sz w:val="22"/>
           <w:szCs w:val="22"/>
         </w:rPr>
-        <w:t xml:space="preserve"> Any notices to us under this Policy must be provided by certified mail, overnight delivery, emailed, or acknowledged fax to: </w:t>
+        <w:t xml:space="preserve">Any notices to us under this Policy must be provided by certified mail, overnight delivery, emailed, or acknowledged fax to: </w:t>
       </w:r>
     </w:p>
     <w:p>
@@ -18542,7 +17734,7 @@
           <w:sz w:val="22"/>
           <w:szCs w:val="22"/>
         </w:rPr>
-        <w:t xml:space="preserve"> TECHNOLOGY RISK RETENTION GROUP, INC. </w:t>
+        <w:t xml:space="preserve">TECHNOLOGY RISK RETENTION GROUP, INC. </w:t>
       </w:r>
     </w:p>
     <w:p>
@@ -18574,7 +17766,7 @@
           <w:sz w:val="22"/>
           <w:szCs w:val="22"/>
         </w:rPr>
-        <w:t xml:space="preserve"> Address: —— </w:t>
+        <w:t xml:space="preserve">Address: —— </w:t>
       </w:r>
     </w:p>
     <w:p>
@@ -18606,7 +17798,7 @@
           <w:sz w:val="22"/>
           <w:szCs w:val="22"/>
         </w:rPr>
-        <w:t xml:space="preserve"> Fax Number: —— </w:t>
+        <w:t xml:space="preserve">Fax Number: —— </w:t>
       </w:r>
     </w:p>
     <w:p>
@@ -18638,7 +17830,7 @@
           <w:sz w:val="22"/>
           <w:szCs w:val="22"/>
         </w:rPr>
-        <w:t xml:space="preserve"> Email: —— </w:t>
+        <w:t xml:space="preserve">Email: —— </w:t>
       </w:r>
     </w:p>
     <w:p>
@@ -18670,7 +17862,7 @@
           <w:sz w:val="22"/>
           <w:szCs w:val="22"/>
         </w:rPr>
-        <w:t xml:space="preserve"> Notices to the </w:t>
+        <w:t xml:space="preserve">Notices to the </w:t>
       </w:r>
       <w:r>
         <w:rPr>
@@ -18726,17 +17918,6 @@
           <w:sz w:val="22"/>
           <w:szCs w:val="22"/>
         </w:rPr>
-        <w:t xml:space="preserve"> </w:t>
-      </w:r>
-      <w:r>
-        <w:rPr>
-          <w:b/>
-          <w:bCs/>
-          <w:rFonts w:ascii="Inter" w:hAnsi="Inter" w:eastAsia="Inter" w:cs="Inter"/>
-          <w:color w:val="000000"/>
-          <w:sz w:val="22"/>
-          <w:szCs w:val="22"/>
-        </w:rPr>
         <w:t xml:space="preserve">Cooperation: </w:t>
       </w:r>
     </w:p>
@@ -18764,17 +17945,6 @@
       </w:pPr>
       <w:r>
         <w:rPr>
-          <w:b/>
-          <w:bCs/>
-          <w:rFonts w:ascii="Inter" w:hAnsi="Inter" w:eastAsia="Inter" w:cs="Inter"/>
-          <w:color w:val="000000"/>
-          <w:sz w:val="22"/>
-          <w:szCs w:val="22"/>
-        </w:rPr>
-        <w:t xml:space="preserve"> </w:t>
-      </w:r>
-      <w:r>
-        <w:rPr>
           <w:rFonts w:ascii="Inter" w:hAnsi="Inter" w:eastAsia="Inter" w:cs="Inter"/>
           <w:color w:val="000000"/>
           <w:sz w:val="22"/>
@@ -18927,17 +18097,6 @@
       </w:pPr>
       <w:r>
         <w:rPr>
-          <w:b/>
-          <w:bCs/>
-          <w:rFonts w:ascii="Inter" w:hAnsi="Inter" w:eastAsia="Inter" w:cs="Inter"/>
-          <w:color w:val="000000"/>
-          <w:sz w:val="22"/>
-          <w:szCs w:val="22"/>
-        </w:rPr>
-        <w:t xml:space="preserve"> </w:t>
-      </w:r>
-      <w:r>
-        <w:rPr>
           <w:rFonts w:ascii="Inter" w:hAnsi="Inter" w:eastAsia="Inter" w:cs="Inter"/>
           <w:color w:val="000000"/>
           <w:sz w:val="22"/>
@@ -19137,17 +18296,6 @@
           <w:sz w:val="22"/>
           <w:szCs w:val="22"/>
         </w:rPr>
-        <w:t xml:space="preserve"> </w:t>
-      </w:r>
-      <w:r>
-        <w:rPr>
-          <w:b/>
-          <w:bCs/>
-          <w:rFonts w:ascii="Inter" w:hAnsi="Inter" w:eastAsia="Inter" w:cs="Inter"/>
-          <w:color w:val="000000"/>
-          <w:sz w:val="22"/>
-          <w:szCs w:val="22"/>
-        </w:rPr>
         <w:t xml:space="preserve">Interrelated Occurrences: Interrelated Occurrences </w:t>
       </w:r>
       <w:r>
@@ -19402,17 +18550,6 @@
           <w:sz w:val="22"/>
           <w:szCs w:val="22"/>
         </w:rPr>
-        <w:t xml:space="preserve"> </w:t>
-      </w:r>
-      <w:r>
-        <w:rPr>
-          <w:b/>
-          <w:bCs/>
-          <w:rFonts w:ascii="Inter" w:hAnsi="Inter" w:eastAsia="Inter" w:cs="Inter"/>
-          <w:color w:val="000000"/>
-          <w:sz w:val="22"/>
-          <w:szCs w:val="22"/>
-        </w:rPr>
         <w:t xml:space="preserve">Other Insurance: </w:t>
       </w:r>
       <w:r>
@@ -19491,15 +18628,6 @@
       <w:proofErr w:type="spellEnd"/>
       <w:r>
         <w:rPr>
-          <w:rFonts w:ascii="Inter" w:hAnsi="Inter" w:eastAsia="Inter" w:cs="Inter"/>
-          <w:color w:val="000000"/>
-          <w:sz w:val="22"/>
-          <w:szCs w:val="22"/>
-        </w:rPr>
-        <w:t xml:space="preserve"> </w:t>
-      </w:r>
-      <w:r>
-        <w:rPr>
           <w:b/>
           <w:bCs/>
           <w:rFonts w:ascii="Inter" w:hAnsi="Inter" w:eastAsia="Inter" w:cs="Inter"/>
@@ -20136,17 +19264,6 @@
           <w:sz w:val="22"/>
           <w:szCs w:val="22"/>
         </w:rPr>
-        <w:t xml:space="preserve"> </w:t>
-      </w:r>
-      <w:r>
-        <w:rPr>
-          <w:b/>
-          <w:bCs/>
-          <w:rFonts w:ascii="Inter" w:hAnsi="Inter" w:eastAsia="Inter" w:cs="Inter"/>
-          <w:color w:val="000000"/>
-          <w:sz w:val="22"/>
-          <w:szCs w:val="22"/>
-        </w:rPr>
         <w:t xml:space="preserve">Premium Audit: </w:t>
       </w:r>
       <w:r>
@@ -20250,17 +19367,6 @@
           <w:sz w:val="22"/>
           <w:szCs w:val="22"/>
         </w:rPr>
-        <w:t xml:space="preserve"> </w:t>
-      </w:r>
-      <w:r>
-        <w:rPr>
-          <w:b/>
-          <w:bCs/>
-          <w:rFonts w:ascii="Inter" w:hAnsi="Inter" w:eastAsia="Inter" w:cs="Inter"/>
-          <w:color w:val="000000"/>
-          <w:sz w:val="22"/>
-          <w:szCs w:val="22"/>
-        </w:rPr>
         <w:t xml:space="preserve">Representations By Insured: </w:t>
       </w:r>
       <w:r>
@@ -20484,17 +19590,6 @@
           <w:sz w:val="22"/>
           <w:szCs w:val="22"/>
         </w:rPr>
-        <w:t xml:space="preserve"> </w:t>
-      </w:r>
-      <w:r>
-        <w:rPr>
-          <w:b/>
-          <w:bCs/>
-          <w:rFonts w:ascii="Inter" w:hAnsi="Inter" w:eastAsia="Inter" w:cs="Inter"/>
-          <w:color w:val="000000"/>
-          <w:sz w:val="22"/>
-          <w:szCs w:val="22"/>
-        </w:rPr>
         <w:t xml:space="preserve">Action Against Us: </w:t>
       </w:r>
       <w:r>
@@ -20668,17 +19763,6 @@
           <w:sz w:val="22"/>
           <w:szCs w:val="22"/>
         </w:rPr>
-        <w:t xml:space="preserve"> </w:t>
-      </w:r>
-      <w:r>
-        <w:rPr>
-          <w:b/>
-          <w:bCs/>
-          <w:rFonts w:ascii="Inter" w:hAnsi="Inter" w:eastAsia="Inter" w:cs="Inter"/>
-          <w:color w:val="000000"/>
-          <w:sz w:val="22"/>
-          <w:szCs w:val="22"/>
-        </w:rPr>
         <w:t xml:space="preserve">Mandatory Bilateral Binding Arbitration: </w:t>
       </w:r>
       <w:r>
@@ -20922,17 +20006,6 @@
           <w:sz w:val="22"/>
           <w:szCs w:val="22"/>
         </w:rPr>
-        <w:t xml:space="preserve"> </w:t>
-      </w:r>
-      <w:r>
-        <w:rPr>
-          <w:b/>
-          <w:bCs/>
-          <w:rFonts w:ascii="Inter" w:hAnsi="Inter" w:eastAsia="Inter" w:cs="Inter"/>
-          <w:color w:val="000000"/>
-          <w:sz w:val="22"/>
-          <w:szCs w:val="22"/>
-        </w:rPr>
         <w:t xml:space="preserve">Named Insured Provisions: </w:t>
       </w:r>
       <w:r>
@@ -21017,7 +20090,6 @@
           <w:szCs w:val="22"/>
         </w:rPr>
         <w:lastRenderedPageBreak/>
-        <w:t xml:space="preserve"> </w:t>
       </w:r>
       <w:r>
         <w:rPr>
@@ -21151,17 +20223,6 @@
           <w:sz w:val="22"/>
           <w:szCs w:val="22"/>
         </w:rPr>
-        <w:t xml:space="preserve"> </w:t>
-      </w:r>
-      <w:r>
-        <w:rPr>
-          <w:b/>
-          <w:bCs/>
-          <w:rFonts w:ascii="Inter" w:hAnsi="Inter" w:eastAsia="Inter" w:cs="Inter"/>
-          <w:color w:val="000000"/>
-          <w:sz w:val="22"/>
-          <w:szCs w:val="22"/>
-        </w:rPr>
         <w:t xml:space="preserve">Changes: </w:t>
       </w:r>
       <w:r>
@@ -21227,17 +20288,6 @@
           <w:sz w:val="22"/>
           <w:szCs w:val="22"/>
         </w:rPr>
-        <w:t xml:space="preserve"> </w:t>
-      </w:r>
-      <w:r>
-        <w:rPr>
-          <w:b/>
-          <w:bCs/>
-          <w:rFonts w:ascii="Inter" w:hAnsi="Inter" w:eastAsia="Inter" w:cs="Inter"/>
-          <w:color w:val="000000"/>
-          <w:sz w:val="22"/>
-          <w:szCs w:val="22"/>
-        </w:rPr>
         <w:t xml:space="preserve">Cancellation and Nonrenewal </w:t>
       </w:r>
     </w:p>
@@ -21269,15 +20319,6 @@
       <w:proofErr w:type="spellEnd"/>
       <w:r>
         <w:rPr>
-          <w:rFonts w:ascii="Inter" w:hAnsi="Inter" w:eastAsia="Inter" w:cs="Inter"/>
-          <w:color w:val="000000"/>
-          <w:sz w:val="22"/>
-          <w:szCs w:val="22"/>
-        </w:rPr>
-        <w:t xml:space="preserve"> </w:t>
-      </w:r>
-      <w:r>
-        <w:rPr>
           <w:b/>
           <w:bCs/>
           <w:rFonts w:ascii="Inter" w:hAnsi="Inter" w:eastAsia="Inter" w:cs="Inter"/>
@@ -21317,7 +20358,7 @@
           <w:sz w:val="22"/>
           <w:szCs w:val="22"/>
         </w:rPr>
-        <w:t xml:space="preserve"> We may cancel this Policy: </w:t>
+        <w:t xml:space="preserve">We may cancel this Policy: </w:t>
       </w:r>
     </w:p>
     <w:p>
@@ -21781,7 +20822,7 @@
           <w:sz w:val="22"/>
           <w:szCs w:val="22"/>
         </w:rPr>
-        <w:t xml:space="preserve"> You may cancel this Policy at any time by mailing written </w:t>
+        <w:t xml:space="preserve">You may cancel this Policy at any time by mailing written </w:t>
       </w:r>
     </w:p>
     <w:p>
@@ -22237,17 +21278,6 @@
           <w:sz w:val="22"/>
           <w:szCs w:val="22"/>
         </w:rPr>
-        <w:t xml:space="preserve"> </w:t>
-      </w:r>
-      <w:r>
-        <w:rPr>
-          <w:b/>
-          <w:bCs/>
-          <w:rFonts w:ascii="Inter" w:hAnsi="Inter" w:eastAsia="Inter" w:cs="Inter"/>
-          <w:color w:val="000000"/>
-          <w:sz w:val="22"/>
-          <w:szCs w:val="22"/>
-        </w:rPr>
         <w:t xml:space="preserve">Assessability: </w:t>
       </w:r>
       <w:r>
@@ -22291,17 +21321,6 @@
           <w:sz w:val="22"/>
           <w:szCs w:val="22"/>
         </w:rPr>
-        <w:t xml:space="preserve"> </w:t>
-      </w:r>
-      <w:r>
-        <w:rPr>
-          <w:b/>
-          <w:bCs/>
-          <w:rFonts w:ascii="Inter" w:hAnsi="Inter" w:eastAsia="Inter" w:cs="Inter"/>
-          <w:color w:val="000000"/>
-          <w:sz w:val="22"/>
-          <w:szCs w:val="22"/>
-        </w:rPr>
         <w:t xml:space="preserve">Titles of Paragraphs: </w:t>
       </w:r>
       <w:r>
@@ -22345,17 +21364,6 @@
           <w:sz w:val="22"/>
           <w:szCs w:val="22"/>
         </w:rPr>
-        <w:t xml:space="preserve"> </w:t>
-      </w:r>
-      <w:r>
-        <w:rPr>
-          <w:b/>
-          <w:bCs/>
-          <w:rFonts w:ascii="Inter" w:hAnsi="Inter" w:eastAsia="Inter" w:cs="Inter"/>
-          <w:color w:val="000000"/>
-          <w:sz w:val="22"/>
-          <w:szCs w:val="22"/>
-        </w:rPr>
         <w:t xml:space="preserve">Coordination of Insuring Agreement: </w:t>
       </w:r>
       <w:proofErr w:type="gramStart"/>
@@ -22530,17 +21538,6 @@
           <w:sz w:val="22"/>
           <w:szCs w:val="22"/>
         </w:rPr>
-        <w:t xml:space="preserve"> </w:t>
-      </w:r>
-      <w:r>
-        <w:rPr>
-          <w:b/>
-          <w:bCs/>
-          <w:rFonts w:ascii="Inter" w:hAnsi="Inter" w:eastAsia="Inter" w:cs="Inter"/>
-          <w:color w:val="000000"/>
-          <w:sz w:val="22"/>
-          <w:szCs w:val="22"/>
-        </w:rPr>
         <w:t xml:space="preserve">Non-Stacking of Limits: </w:t>
       </w:r>
       <w:r>
@@ -22644,7 +21641,7 @@
           <w:sz w:val="22"/>
           <w:szCs w:val="22"/>
         </w:rPr>
-        <w:t xml:space="preserve"> the </w:t>
+        <w:t xml:space="preserve">the </w:t>
       </w:r>
       <w:r>
         <w:rPr>
@@ -22760,17 +21757,6 @@
       </w:pPr>
       <w:r>
         <w:rPr>
-          <w:b/>
-          <w:bCs/>
-          <w:rFonts w:ascii="Inter" w:hAnsi="Inter" w:eastAsia="Inter" w:cs="Inter"/>
-          <w:color w:val="000000"/>
-          <w:sz w:val="22"/>
-          <w:szCs w:val="22"/>
-        </w:rPr>
-        <w:t xml:space="preserve"> </w:t>
-      </w:r>
-      <w:r>
-        <w:rPr>
           <w:rFonts w:ascii="Inter" w:hAnsi="Inter" w:eastAsia="Inter" w:cs="Inter"/>
           <w:color w:val="000000"/>
           <w:sz w:val="22"/>
@@ -22821,17 +21807,6 @@
           <w:numId w:val="9007"/>
         </w:numPr>
       </w:pPr>
-      <w:r>
-        <w:rPr>
-          <w:b/>
-          <w:bCs/>
-          <w:rFonts w:ascii="Inter" w:hAnsi="Inter" w:eastAsia="Inter" w:cs="Inter"/>
-          <w:color w:val="000000"/>
-          <w:sz w:val="22"/>
-          <w:szCs w:val="22"/>
-        </w:rPr>
-        <w:t xml:space="preserve"> </w:t>
-      </w:r>
       <w:r>
         <w:rPr>
           <w:rFonts w:ascii="Inter" w:hAnsi="Inter" w:eastAsia="Inter" w:cs="Inter"/>
@@ -22981,6 +21956,7 @@
     <w:lvl w:ilvl="0">
       <w:start w:val="1"/>
       <w:numFmt w:val="upperLetter"/>
+      <w:suff w:val="space"/>
       <w:lvlText w:val="%1."/>
       <w:lvlJc w:val="left"/>
       <w:pPr>
@@ -22990,6 +21966,7 @@
     <w:lvl w:ilvl="1">
       <w:start w:val="1"/>
       <w:numFmt w:val="decimal"/>
+      <w:suff w:val="space"/>
       <w:lvlText w:val="%2."/>
       <w:lvlJc w:val="left"/>
       <w:pPr>
@@ -22999,6 +21976,7 @@
     <w:lvl w:ilvl="2">
       <w:start w:val="1"/>
       <w:numFmt w:val="lowerLetter"/>
+      <w:suff w:val="space"/>
       <w:lvlText w:val="%3."/>
       <w:lvlJc w:val="left"/>
       <w:pPr>
@@ -23008,6 +21986,7 @@
     <w:lvl w:ilvl="3">
       <w:start w:val="1"/>
       <w:numFmt w:val="decimal"/>
+      <w:suff w:val="space"/>
       <w:lvlText w:val="(%4)"/>
       <w:lvlJc w:val="left"/>
       <w:pPr>
@@ -23017,6 +21996,7 @@
     <w:lvl w:ilvl="4">
       <w:start w:val="1"/>
       <w:numFmt w:val="lowerLetter"/>
+      <w:suff w:val="space"/>
       <w:lvlText w:val="(%5)"/>
       <w:lvlJc w:val="left"/>
       <w:pPr>
@@ -23026,6 +22006,7 @@
     <w:lvl w:ilvl="5">
       <w:start w:val="1"/>
       <w:numFmt w:val="lowerRoman"/>
+      <w:suff w:val="space"/>
       <w:lvlText w:val="(%6)"/>
       <w:lvlJc w:val="left"/>
       <w:pPr>
@@ -23035,6 +22016,7 @@
     <w:lvl w:ilvl="6">
       <w:start w:val="1"/>
       <w:numFmt w:val="decimal"/>
+      <w:suff w:val="space"/>
       <w:lvlText w:val="%7."/>
       <w:lvlJc w:val="left"/>
       <w:pPr>
@@ -23044,6 +22026,7 @@
     <w:lvl w:ilvl="7">
       <w:start w:val="1"/>
       <w:numFmt w:val="lowerLetter"/>
+      <w:suff w:val="space"/>
       <w:lvlText w:val="%8."/>
       <w:lvlJc w:val="left"/>
       <w:pPr>
@@ -23053,6 +22036,7 @@
     <w:lvl w:ilvl="8">
       <w:start w:val="1"/>
       <w:numFmt w:val="lowerRoman"/>
+      <w:suff w:val="space"/>
       <w:lvlText w:val="%9."/>
       <w:lvlJc w:val="left"/>
       <w:pPr>

</xml_diff>

<commit_message>
regenerate cgl + seic_do goldens: drop stale paragraph-mark rPr on list items
Picks up set_numPr's clearing of the paragraph-mark rPr so list
markers no longer inherit a previous heading paragraph's bold +
display-font formatting.
</commit_message>
<xml_diff>
--- a/tests/golden/cgl_original_formatted.docx
+++ b/tests/golden/cgl_original_formatted.docx
@@ -326,10 +326,6 @@
           <w:right w:val="nil"/>
           <w:between w:val="nil"/>
         </w:pBdr>
-        <w:rPr>
-          <w:rFonts w:ascii="Inter" w:eastAsia="Inter" w:hAnsi="Inter" w:cs="Inter"/>
-          <w:color w:val="000000"/>
-        </w:rPr>
         <w:jc w:val="left"/>
         <w:spacing w:after="200"/>
         <w:numPr>
@@ -509,10 +505,6 @@
           <w:right w:val="nil"/>
           <w:between w:val="nil"/>
         </w:pBdr>
-        <w:rPr>
-          <w:rFonts w:ascii="Inter" w:eastAsia="Inter" w:hAnsi="Inter" w:cs="Inter"/>
-          <w:color w:val="000000"/>
-        </w:rPr>
         <w:jc w:val="left"/>
         <w:spacing w:after="200"/>
         <w:numPr>
@@ -761,10 +753,6 @@
           <w:right w:val="nil"/>
           <w:between w:val="nil"/>
         </w:pBdr>
-        <w:rPr>
-          <w:rFonts w:ascii="Inter" w:eastAsia="Inter" w:hAnsi="Inter" w:cs="Inter"/>
-          <w:color w:val="000000"/>
-        </w:rPr>
         <w:jc w:val="left"/>
         <w:spacing w:after="200"/>
         <w:numPr>
@@ -933,10 +921,6 @@
           <w:right w:val="nil"/>
           <w:between w:val="nil"/>
         </w:pBdr>
-        <w:rPr>
-          <w:rFonts w:ascii="Inter" w:eastAsia="Inter" w:hAnsi="Inter" w:cs="Inter"/>
-          <w:color w:val="000000"/>
-        </w:rPr>
         <w:jc w:val="left"/>
         <w:spacing w:after="200"/>
         <w:numPr>
@@ -1005,10 +989,6 @@
           <w:right w:val="nil"/>
           <w:between w:val="nil"/>
         </w:pBdr>
-        <w:rPr>
-          <w:rFonts w:ascii="Inter" w:eastAsia="Inter" w:hAnsi="Inter" w:cs="Inter"/>
-          <w:color w:val="000000"/>
-        </w:rPr>
         <w:jc w:val="left"/>
         <w:spacing w:after="200"/>
         <w:numPr>
@@ -1287,10 +1267,6 @@
           <w:right w:val="nil"/>
           <w:between w:val="nil"/>
         </w:pBdr>
-        <w:rPr>
-          <w:rFonts w:ascii="Inter" w:eastAsia="Inter" w:hAnsi="Inter" w:cs="Inter"/>
-          <w:color w:val="000000"/>
-        </w:rPr>
         <w:jc w:val="left"/>
         <w:spacing w:after="200"/>
         <w:numPr>
@@ -1539,10 +1515,6 @@
           <w:right w:val="nil"/>
           <w:between w:val="nil"/>
         </w:pBdr>
-        <w:rPr>
-          <w:rFonts w:ascii="Inter" w:eastAsia="Inter" w:hAnsi="Inter" w:cs="Inter"/>
-          <w:color w:val="000000"/>
-        </w:rPr>
         <w:jc w:val="left"/>
         <w:spacing w:after="200"/>
         <w:numPr>
@@ -1602,10 +1574,6 @@
           <w:right w:val="nil"/>
           <w:between w:val="nil"/>
         </w:pBdr>
-        <w:rPr>
-          <w:rFonts w:ascii="Inter" w:eastAsia="Inter" w:hAnsi="Inter" w:cs="Inter"/>
-          <w:color w:val="000000"/>
-        </w:rPr>
         <w:jc w:val="left"/>
         <w:spacing w:after="200"/>
         <w:numPr>
@@ -1655,10 +1623,6 @@
           <w:right w:val="nil"/>
           <w:between w:val="nil"/>
         </w:pBdr>
-        <w:rPr>
-          <w:rFonts w:ascii="Inter" w:eastAsia="Inter" w:hAnsi="Inter" w:cs="Inter"/>
-          <w:color w:val="000000"/>
-        </w:rPr>
         <w:jc w:val="left"/>
         <w:spacing w:after="200"/>
         <w:numPr>
@@ -1820,10 +1784,6 @@
           <w:right w:val="nil"/>
           <w:between w:val="nil"/>
         </w:pBdr>
-        <w:rPr>
-          <w:rFonts w:ascii="Inter" w:eastAsia="Inter" w:hAnsi="Inter" w:cs="Inter"/>
-          <w:color w:val="000000"/>
-        </w:rPr>
         <w:jc w:val="left"/>
         <w:spacing w:after="200"/>
         <w:numPr>
@@ -1994,10 +1954,6 @@
           <w:right w:val="nil"/>
           <w:between w:val="nil"/>
         </w:pBdr>
-        <w:rPr>
-          <w:rFonts w:ascii="Inter" w:eastAsia="Inter" w:hAnsi="Inter" w:cs="Inter"/>
-          <w:color w:val="000000"/>
-        </w:rPr>
         <w:jc w:val="left"/>
         <w:spacing w:after="200"/>
         <w:numPr>
@@ -3039,10 +2995,6 @@
           <w:right w:val="nil"/>
           <w:between w:val="nil"/>
         </w:pBdr>
-        <w:rPr>
-          <w:rFonts w:ascii="Inter" w:eastAsia="Inter" w:hAnsi="Inter" w:cs="Inter"/>
-          <w:color w:val="000000"/>
-        </w:rPr>
         <w:jc w:val="left"/>
         <w:spacing w:after="200"/>
         <w:numPr>
@@ -3102,10 +3054,6 @@
           <w:right w:val="nil"/>
           <w:between w:val="nil"/>
         </w:pBdr>
-        <w:rPr>
-          <w:rFonts w:ascii="Inter" w:eastAsia="Inter" w:hAnsi="Inter" w:cs="Inter"/>
-          <w:color w:val="000000"/>
-        </w:rPr>
         <w:jc w:val="left"/>
         <w:spacing w:after="200"/>
         <w:numPr>
@@ -3205,10 +3153,6 @@
           <w:right w:val="nil"/>
           <w:between w:val="nil"/>
         </w:pBdr>
-        <w:rPr>
-          <w:rFonts w:ascii="Inter" w:eastAsia="Inter" w:hAnsi="Inter" w:cs="Inter"/>
-          <w:color w:val="000000"/>
-        </w:rPr>
         <w:jc w:val="left"/>
         <w:spacing w:after="200"/>
         <w:numPr>
@@ -3297,10 +3241,6 @@
           <w:right w:val="nil"/>
           <w:between w:val="nil"/>
         </w:pBdr>
-        <w:rPr>
-          <w:rFonts w:ascii="Inter" w:eastAsia="Inter" w:hAnsi="Inter" w:cs="Inter"/>
-          <w:color w:val="000000"/>
-        </w:rPr>
         <w:jc w:val="left"/>
         <w:spacing w:after="200"/>
         <w:numPr>
@@ -3380,10 +3320,6 @@
           <w:right w:val="nil"/>
           <w:between w:val="nil"/>
         </w:pBdr>
-        <w:rPr>
-          <w:rFonts w:ascii="Inter" w:eastAsia="Inter" w:hAnsi="Inter" w:cs="Inter"/>
-          <w:color w:val="000000"/>
-        </w:rPr>
         <w:jc w:val="left"/>
         <w:spacing w:after="200"/>
         <w:numPr>
@@ -3423,10 +3359,6 @@
           <w:right w:val="nil"/>
           <w:between w:val="nil"/>
         </w:pBdr>
-        <w:rPr>
-          <w:rFonts w:ascii="Inter" w:eastAsia="Inter" w:hAnsi="Inter" w:cs="Inter"/>
-          <w:color w:val="000000"/>
-        </w:rPr>
         <w:jc w:val="left"/>
         <w:spacing w:after="200"/>
         <w:numPr>
@@ -3535,10 +3467,6 @@
           <w:right w:val="nil"/>
           <w:between w:val="nil"/>
         </w:pBdr>
-        <w:rPr>
-          <w:rFonts w:ascii="Inter" w:eastAsia="Inter" w:hAnsi="Inter" w:cs="Inter"/>
-          <w:color w:val="000000"/>
-        </w:rPr>
         <w:jc w:val="left"/>
         <w:spacing w:after="200"/>
         <w:numPr>
@@ -3578,10 +3506,6 @@
           <w:right w:val="nil"/>
           <w:between w:val="nil"/>
         </w:pBdr>
-        <w:rPr>
-          <w:rFonts w:ascii="Inter" w:eastAsia="Inter" w:hAnsi="Inter" w:cs="Inter"/>
-          <w:color w:val="000000"/>
-        </w:rPr>
         <w:jc w:val="left"/>
         <w:spacing w:after="200"/>
         <w:numPr>
@@ -3641,10 +3565,6 @@
           <w:right w:val="nil"/>
           <w:between w:val="nil"/>
         </w:pBdr>
-        <w:rPr>
-          <w:rFonts w:ascii="Inter" w:eastAsia="Inter" w:hAnsi="Inter" w:cs="Inter"/>
-          <w:color w:val="000000"/>
-        </w:rPr>
         <w:jc w:val="left"/>
         <w:spacing w:after="200"/>
         <w:numPr>
@@ -3684,10 +3604,6 @@
           <w:right w:val="nil"/>
           <w:between w:val="nil"/>
         </w:pBdr>
-        <w:rPr>
-          <w:rFonts w:ascii="Inter" w:eastAsia="Inter" w:hAnsi="Inter" w:cs="Inter"/>
-          <w:color w:val="000000"/>
-        </w:rPr>
         <w:jc w:val="left"/>
         <w:spacing w:after="200"/>
         <w:numPr>
@@ -3716,10 +3632,6 @@
           <w:right w:val="nil"/>
           <w:between w:val="nil"/>
         </w:pBdr>
-        <w:rPr>
-          <w:rFonts w:ascii="Inter" w:eastAsia="Inter" w:hAnsi="Inter" w:cs="Inter"/>
-          <w:color w:val="000000"/>
-        </w:rPr>
         <w:jc w:val="left"/>
         <w:spacing w:after="200"/>
         <w:numPr>
@@ -3808,10 +3720,6 @@
           <w:right w:val="nil"/>
           <w:between w:val="nil"/>
         </w:pBdr>
-        <w:rPr>
-          <w:rFonts w:ascii="Inter" w:eastAsia="Inter" w:hAnsi="Inter" w:cs="Inter"/>
-          <w:color w:val="000000"/>
-        </w:rPr>
         <w:jc w:val="left"/>
         <w:spacing w:after="200"/>
         <w:numPr>
@@ -3989,10 +3897,6 @@
           <w:right w:val="nil"/>
           <w:between w:val="nil"/>
         </w:pBdr>
-        <w:rPr>
-          <w:rFonts w:ascii="Inter" w:eastAsia="Inter" w:hAnsi="Inter" w:cs="Inter"/>
-          <w:color w:val="000000"/>
-        </w:rPr>
         <w:jc w:val="left"/>
         <w:spacing w:after="200"/>
         <w:numPr>
@@ -4092,10 +3996,6 @@
           <w:right w:val="nil"/>
           <w:between w:val="nil"/>
         </w:pBdr>
-        <w:rPr>
-          <w:rFonts w:ascii="Inter" w:eastAsia="Inter" w:hAnsi="Inter" w:cs="Inter"/>
-          <w:color w:val="000000"/>
-        </w:rPr>
         <w:jc w:val="left"/>
         <w:spacing w:after="200"/>
         <w:numPr>
@@ -4144,10 +4044,6 @@
           <w:right w:val="nil"/>
           <w:between w:val="nil"/>
         </w:pBdr>
-        <w:rPr>
-          <w:rFonts w:ascii="Inter" w:eastAsia="Inter" w:hAnsi="Inter" w:cs="Inter"/>
-          <w:color w:val="000000"/>
-        </w:rPr>
         <w:jc w:val="left"/>
         <w:spacing w:after="200"/>
         <w:numPr>
@@ -4296,10 +4192,6 @@
           <w:right w:val="nil"/>
           <w:between w:val="nil"/>
         </w:pBdr>
-        <w:rPr>
-          <w:rFonts w:ascii="Inter" w:eastAsia="Inter" w:hAnsi="Inter" w:cs="Inter"/>
-          <w:color w:val="000000"/>
-        </w:rPr>
         <w:jc w:val="left"/>
         <w:spacing w:after="200"/>
         <w:numPr>
@@ -4388,10 +4280,6 @@
           <w:right w:val="nil"/>
           <w:between w:val="nil"/>
         </w:pBdr>
-        <w:rPr>
-          <w:rFonts w:ascii="Inter" w:eastAsia="Inter" w:hAnsi="Inter" w:cs="Inter"/>
-          <w:color w:val="000000"/>
-        </w:rPr>
         <w:jc w:val="left"/>
         <w:spacing w:after="200"/>
         <w:numPr>
@@ -4431,10 +4319,6 @@
           <w:right w:val="nil"/>
           <w:between w:val="nil"/>
         </w:pBdr>
-        <w:rPr>
-          <w:rFonts w:ascii="Inter" w:eastAsia="Inter" w:hAnsi="Inter" w:cs="Inter"/>
-          <w:color w:val="000000"/>
-        </w:rPr>
         <w:jc w:val="left"/>
         <w:spacing w:after="200"/>
         <w:numPr>
@@ -4494,10 +4378,6 @@
           <w:right w:val="nil"/>
           <w:between w:val="nil"/>
         </w:pBdr>
-        <w:rPr>
-          <w:rFonts w:ascii="Inter" w:eastAsia="Inter" w:hAnsi="Inter" w:cs="Inter"/>
-          <w:color w:val="000000"/>
-        </w:rPr>
         <w:jc w:val="left"/>
         <w:spacing w:after="200"/>
         <w:numPr>
@@ -4577,10 +4457,6 @@
           <w:right w:val="nil"/>
           <w:between w:val="nil"/>
         </w:pBdr>
-        <w:rPr>
-          <w:rFonts w:ascii="Inter" w:eastAsia="Inter" w:hAnsi="Inter" w:cs="Inter"/>
-          <w:color w:val="000000"/>
-        </w:rPr>
         <w:jc w:val="left"/>
         <w:spacing w:after="200"/>
         <w:numPr>
@@ -4649,10 +4525,6 @@
           <w:right w:val="nil"/>
           <w:between w:val="nil"/>
         </w:pBdr>
-        <w:rPr>
-          <w:rFonts w:ascii="Inter" w:eastAsia="Inter" w:hAnsi="Inter" w:cs="Inter"/>
-          <w:color w:val="000000"/>
-        </w:rPr>
         <w:jc w:val="left"/>
         <w:spacing w:after="200"/>
         <w:numPr>
@@ -4741,10 +4613,6 @@
           <w:right w:val="nil"/>
           <w:between w:val="nil"/>
         </w:pBdr>
-        <w:rPr>
-          <w:rFonts w:ascii="Inter" w:eastAsia="Inter" w:hAnsi="Inter" w:cs="Inter"/>
-          <w:color w:val="000000"/>
-        </w:rPr>
         <w:jc w:val="left"/>
         <w:spacing w:after="200"/>
         <w:numPr>
@@ -4824,10 +4692,6 @@
           <w:right w:val="nil"/>
           <w:between w:val="nil"/>
         </w:pBdr>
-        <w:rPr>
-          <w:rFonts w:ascii="Inter" w:eastAsia="Inter" w:hAnsi="Inter" w:cs="Inter"/>
-          <w:color w:val="000000"/>
-        </w:rPr>
         <w:jc w:val="left"/>
         <w:spacing w:after="200"/>
         <w:numPr>
@@ -4867,10 +4731,6 @@
           <w:right w:val="nil"/>
           <w:between w:val="nil"/>
         </w:pBdr>
-        <w:rPr>
-          <w:rFonts w:ascii="Inter" w:eastAsia="Inter" w:hAnsi="Inter" w:cs="Inter"/>
-          <w:color w:val="000000"/>
-        </w:rPr>
         <w:jc w:val="left"/>
         <w:spacing w:after="200"/>
         <w:numPr>
@@ -4919,10 +4779,6 @@
           <w:right w:val="nil"/>
           <w:between w:val="nil"/>
         </w:pBdr>
-        <w:rPr>
-          <w:rFonts w:ascii="Inter" w:eastAsia="Inter" w:hAnsi="Inter" w:cs="Inter"/>
-          <w:color w:val="000000"/>
-        </w:rPr>
         <w:jc w:val="left"/>
         <w:spacing w:after="200"/>
         <w:numPr>
@@ -4971,10 +4827,6 @@
           <w:right w:val="nil"/>
           <w:between w:val="nil"/>
         </w:pBdr>
-        <w:rPr>
-          <w:rFonts w:ascii="Inter" w:eastAsia="Inter" w:hAnsi="Inter" w:cs="Inter"/>
-          <w:color w:val="000000"/>
-        </w:rPr>
         <w:jc w:val="left"/>
         <w:spacing w:after="200"/>
         <w:numPr>
@@ -5145,10 +4997,6 @@
           <w:right w:val="nil"/>
           <w:between w:val="nil"/>
         </w:pBdr>
-        <w:rPr>
-          <w:rFonts w:ascii="Inter" w:eastAsia="Inter" w:hAnsi="Inter" w:cs="Inter"/>
-          <w:color w:val="000000"/>
-        </w:rPr>
         <w:jc w:val="left"/>
         <w:spacing w:after="200"/>
         <w:numPr>
@@ -5188,10 +5036,6 @@
           <w:right w:val="nil"/>
           <w:between w:val="nil"/>
         </w:pBdr>
-        <w:rPr>
-          <w:rFonts w:ascii="Inter" w:eastAsia="Inter" w:hAnsi="Inter" w:cs="Inter"/>
-          <w:color w:val="000000"/>
-        </w:rPr>
         <w:jc w:val="left"/>
         <w:spacing w:after="200"/>
         <w:numPr>
@@ -5301,10 +5145,6 @@
           <w:right w:val="nil"/>
           <w:between w:val="nil"/>
         </w:pBdr>
-        <w:rPr>
-          <w:rFonts w:ascii="Inter" w:eastAsia="Inter" w:hAnsi="Inter" w:cs="Inter"/>
-          <w:color w:val="000000"/>
-        </w:rPr>
         <w:jc w:val="left"/>
         <w:spacing w:after="200"/>
         <w:numPr>
@@ -5344,10 +5184,6 @@
           <w:right w:val="nil"/>
           <w:between w:val="nil"/>
         </w:pBdr>
-        <w:rPr>
-          <w:rFonts w:ascii="Inter" w:eastAsia="Inter" w:hAnsi="Inter" w:cs="Inter"/>
-          <w:color w:val="000000"/>
-        </w:rPr>
         <w:jc w:val="left"/>
         <w:spacing w:after="200"/>
         <w:numPr>
@@ -5387,10 +5223,6 @@
           <w:right w:val="nil"/>
           <w:between w:val="nil"/>
         </w:pBdr>
-        <w:rPr>
-          <w:rFonts w:ascii="Inter" w:eastAsia="Inter" w:hAnsi="Inter" w:cs="Inter"/>
-          <w:color w:val="000000"/>
-        </w:rPr>
         <w:jc w:val="left"/>
         <w:spacing w:after="200"/>
         <w:numPr>
@@ -5430,10 +5262,6 @@
           <w:right w:val="nil"/>
           <w:between w:val="nil"/>
         </w:pBdr>
-        <w:rPr>
-          <w:rFonts w:ascii="Inter" w:eastAsia="Inter" w:hAnsi="Inter" w:cs="Inter"/>
-          <w:color w:val="000000"/>
-        </w:rPr>
         <w:jc w:val="left"/>
         <w:spacing w:after="200"/>
         <w:numPr>
@@ -5493,10 +5321,6 @@
           <w:right w:val="nil"/>
           <w:between w:val="nil"/>
         </w:pBdr>
-        <w:rPr>
-          <w:rFonts w:ascii="Inter" w:eastAsia="Inter" w:hAnsi="Inter" w:cs="Inter"/>
-          <w:color w:val="000000"/>
-        </w:rPr>
         <w:jc w:val="left"/>
         <w:spacing w:after="200"/>
         <w:numPr>
@@ -5525,10 +5349,6 @@
           <w:right w:val="nil"/>
           <w:between w:val="nil"/>
         </w:pBdr>
-        <w:rPr>
-          <w:rFonts w:ascii="Inter" w:eastAsia="Inter" w:hAnsi="Inter" w:cs="Inter"/>
-          <w:color w:val="000000"/>
-        </w:rPr>
         <w:jc w:val="left"/>
         <w:spacing w:after="200"/>
         <w:numPr>
@@ -5557,10 +5377,6 @@
           <w:right w:val="nil"/>
           <w:between w:val="nil"/>
         </w:pBdr>
-        <w:rPr>
-          <w:rFonts w:ascii="Inter" w:eastAsia="Inter" w:hAnsi="Inter" w:cs="Inter"/>
-          <w:color w:val="000000"/>
-        </w:rPr>
         <w:jc w:val="left"/>
         <w:spacing w:after="200"/>
         <w:numPr>
@@ -5669,10 +5485,6 @@
           <w:right w:val="nil"/>
           <w:between w:val="nil"/>
         </w:pBdr>
-        <w:rPr>
-          <w:rFonts w:ascii="Inter" w:eastAsia="Inter" w:hAnsi="Inter" w:cs="Inter"/>
-          <w:color w:val="000000"/>
-        </w:rPr>
         <w:jc w:val="left"/>
         <w:spacing w:after="200"/>
         <w:numPr>
@@ -5752,10 +5564,6 @@
           <w:right w:val="nil"/>
           <w:between w:val="nil"/>
         </w:pBdr>
-        <w:rPr>
-          <w:rFonts w:ascii="Inter" w:eastAsia="Inter" w:hAnsi="Inter" w:cs="Inter"/>
-          <w:color w:val="000000"/>
-        </w:rPr>
         <w:jc w:val="left"/>
         <w:spacing w:after="200"/>
         <w:numPr>
@@ -5875,10 +5683,6 @@
           <w:right w:val="nil"/>
           <w:between w:val="nil"/>
         </w:pBdr>
-        <w:rPr>
-          <w:rFonts w:ascii="Inter" w:eastAsia="Inter" w:hAnsi="Inter" w:cs="Inter"/>
-          <w:color w:val="000000"/>
-        </w:rPr>
         <w:jc w:val="left"/>
         <w:spacing w:after="200"/>
         <w:numPr>
@@ -5907,10 +5711,6 @@
           <w:right w:val="nil"/>
           <w:between w:val="nil"/>
         </w:pBdr>
-        <w:rPr>
-          <w:rFonts w:ascii="Inter" w:eastAsia="Inter" w:hAnsi="Inter" w:cs="Inter"/>
-          <w:color w:val="000000"/>
-        </w:rPr>
         <w:jc w:val="left"/>
         <w:spacing w:after="200"/>
         <w:numPr>
@@ -5959,10 +5759,6 @@
           <w:right w:val="nil"/>
           <w:between w:val="nil"/>
         </w:pBdr>
-        <w:rPr>
-          <w:rFonts w:ascii="Inter" w:eastAsia="Inter" w:hAnsi="Inter" w:cs="Inter"/>
-          <w:color w:val="000000"/>
-        </w:rPr>
         <w:jc w:val="left"/>
         <w:spacing w:after="200"/>
         <w:numPr>
@@ -6091,10 +5887,6 @@
           <w:right w:val="nil"/>
           <w:between w:val="nil"/>
         </w:pBdr>
-        <w:rPr>
-          <w:rFonts w:ascii="Inter" w:eastAsia="Inter" w:hAnsi="Inter" w:cs="Inter"/>
-          <w:color w:val="000000"/>
-        </w:rPr>
         <w:jc w:val="left"/>
         <w:spacing w:after="200"/>
         <w:numPr>
@@ -6184,10 +5976,6 @@
           <w:right w:val="nil"/>
           <w:between w:val="nil"/>
         </w:pBdr>
-        <w:rPr>
-          <w:rFonts w:ascii="Inter" w:eastAsia="Inter" w:hAnsi="Inter" w:cs="Inter"/>
-          <w:color w:val="000000"/>
-        </w:rPr>
         <w:jc w:val="left"/>
         <w:spacing w:after="200"/>
         <w:numPr>
@@ -6227,10 +6015,6 @@
           <w:right w:val="nil"/>
           <w:between w:val="nil"/>
         </w:pBdr>
-        <w:rPr>
-          <w:rFonts w:ascii="Inter" w:eastAsia="Inter" w:hAnsi="Inter" w:cs="Inter"/>
-          <w:color w:val="000000"/>
-        </w:rPr>
         <w:jc w:val="left"/>
         <w:spacing w:after="200"/>
         <w:numPr>
@@ -6259,10 +6043,6 @@
           <w:right w:val="nil"/>
           <w:between w:val="nil"/>
         </w:pBdr>
-        <w:rPr>
-          <w:rFonts w:ascii="Inter" w:eastAsia="Inter" w:hAnsi="Inter" w:cs="Inter"/>
-          <w:color w:val="000000"/>
-        </w:rPr>
         <w:jc w:val="left"/>
         <w:spacing w:after="200"/>
         <w:numPr>
@@ -6311,10 +6091,6 @@
           <w:right w:val="nil"/>
           <w:between w:val="nil"/>
         </w:pBdr>
-        <w:rPr>
-          <w:rFonts w:ascii="Inter" w:eastAsia="Inter" w:hAnsi="Inter" w:cs="Inter"/>
-          <w:color w:val="000000"/>
-        </w:rPr>
         <w:jc w:val="left"/>
         <w:spacing w:after="200"/>
         <w:numPr>
@@ -6354,10 +6130,6 @@
           <w:right w:val="nil"/>
           <w:between w:val="nil"/>
         </w:pBdr>
-        <w:rPr>
-          <w:rFonts w:ascii="Inter" w:eastAsia="Inter" w:hAnsi="Inter" w:cs="Inter"/>
-          <w:color w:val="000000"/>
-        </w:rPr>
         <w:jc w:val="left"/>
         <w:spacing w:after="200"/>
         <w:numPr>
@@ -6477,10 +6249,6 @@
           <w:right w:val="nil"/>
           <w:between w:val="nil"/>
         </w:pBdr>
-        <w:rPr>
-          <w:rFonts w:ascii="Inter" w:eastAsia="Inter" w:hAnsi="Inter" w:cs="Inter"/>
-          <w:color w:val="000000"/>
-        </w:rPr>
         <w:jc w:val="left"/>
         <w:spacing w:after="200"/>
         <w:numPr>
@@ -6560,10 +6328,6 @@
           <w:right w:val="nil"/>
           <w:between w:val="nil"/>
         </w:pBdr>
-        <w:rPr>
-          <w:rFonts w:ascii="Inter" w:eastAsia="Inter" w:hAnsi="Inter" w:cs="Inter"/>
-          <w:color w:val="000000"/>
-        </w:rPr>
         <w:jc w:val="left"/>
         <w:spacing w:after="200"/>
         <w:numPr>
@@ -6603,10 +6367,6 @@
           <w:right w:val="nil"/>
           <w:between w:val="nil"/>
         </w:pBdr>
-        <w:rPr>
-          <w:rFonts w:ascii="Inter" w:eastAsia="Inter" w:hAnsi="Inter" w:cs="Inter"/>
-          <w:color w:val="000000"/>
-        </w:rPr>
         <w:jc w:val="left"/>
         <w:spacing w:after="200"/>
         <w:numPr>
@@ -6715,10 +6475,6 @@
           <w:right w:val="nil"/>
           <w:between w:val="nil"/>
         </w:pBdr>
-        <w:rPr>
-          <w:rFonts w:ascii="Inter" w:eastAsia="Inter" w:hAnsi="Inter" w:cs="Inter"/>
-          <w:color w:val="000000"/>
-        </w:rPr>
         <w:jc w:val="left"/>
         <w:spacing w:after="200"/>
         <w:numPr>
@@ -6838,10 +6594,6 @@
           <w:right w:val="nil"/>
           <w:between w:val="nil"/>
         </w:pBdr>
-        <w:rPr>
-          <w:rFonts w:ascii="Inter" w:eastAsia="Inter" w:hAnsi="Inter" w:cs="Inter"/>
-          <w:color w:val="000000"/>
-        </w:rPr>
         <w:jc w:val="left"/>
         <w:spacing w:after="200"/>
         <w:numPr>
@@ -6939,10 +6691,6 @@
           <w:right w:val="nil"/>
           <w:between w:val="nil"/>
         </w:pBdr>
-        <w:rPr>
-          <w:rFonts w:ascii="Inter" w:eastAsia="Inter" w:hAnsi="Inter" w:cs="Inter"/>
-          <w:color w:val="000000"/>
-        </w:rPr>
         <w:jc w:val="left"/>
         <w:spacing w:after="200"/>
         <w:numPr>
@@ -6972,10 +6720,6 @@
           <w:right w:val="nil"/>
           <w:between w:val="nil"/>
         </w:pBdr>
-        <w:rPr>
-          <w:rFonts w:ascii="Inter" w:eastAsia="Inter" w:hAnsi="Inter" w:cs="Inter"/>
-          <w:color w:val="000000"/>
-        </w:rPr>
         <w:jc w:val="left"/>
         <w:spacing w:after="200"/>
         <w:numPr>
@@ -7004,10 +6748,6 @@
           <w:right w:val="nil"/>
           <w:between w:val="nil"/>
         </w:pBdr>
-        <w:rPr>
-          <w:rFonts w:ascii="Inter" w:eastAsia="Inter" w:hAnsi="Inter" w:cs="Inter"/>
-          <w:color w:val="000000"/>
-        </w:rPr>
         <w:jc w:val="left"/>
         <w:spacing w:after="200"/>
         <w:numPr>
@@ -7085,10 +6825,6 @@
           <w:right w:val="nil"/>
           <w:between w:val="nil"/>
         </w:pBdr>
-        <w:rPr>
-          <w:rFonts w:ascii="Inter" w:eastAsia="Inter" w:hAnsi="Inter" w:cs="Inter"/>
-          <w:color w:val="000000"/>
-        </w:rPr>
         <w:jc w:val="left"/>
         <w:spacing w:after="200"/>
         <w:numPr>
@@ -7128,10 +6864,6 @@
           <w:right w:val="nil"/>
           <w:between w:val="nil"/>
         </w:pBdr>
-        <w:rPr>
-          <w:rFonts w:ascii="Inter" w:eastAsia="Inter" w:hAnsi="Inter" w:cs="Inter"/>
-          <w:color w:val="000000"/>
-        </w:rPr>
         <w:jc w:val="left"/>
         <w:spacing w:after="200"/>
         <w:numPr>
@@ -7180,10 +6912,6 @@
           <w:right w:val="nil"/>
           <w:between w:val="nil"/>
         </w:pBdr>
-        <w:rPr>
-          <w:rFonts w:ascii="Inter" w:eastAsia="Inter" w:hAnsi="Inter" w:cs="Inter"/>
-          <w:color w:val="000000"/>
-        </w:rPr>
         <w:jc w:val="left"/>
         <w:spacing w:after="200"/>
         <w:numPr>
@@ -7272,10 +7000,6 @@
           <w:right w:val="nil"/>
           <w:between w:val="nil"/>
         </w:pBdr>
-        <w:rPr>
-          <w:rFonts w:ascii="Inter" w:eastAsia="Inter" w:hAnsi="Inter" w:cs="Inter"/>
-          <w:color w:val="000000"/>
-        </w:rPr>
         <w:jc w:val="left"/>
         <w:spacing w:after="200"/>
         <w:numPr>
@@ -7315,10 +7039,6 @@
           <w:right w:val="nil"/>
           <w:between w:val="nil"/>
         </w:pBdr>
-        <w:rPr>
-          <w:rFonts w:ascii="Inter" w:eastAsia="Inter" w:hAnsi="Inter" w:cs="Inter"/>
-          <w:color w:val="000000"/>
-        </w:rPr>
         <w:jc w:val="left"/>
         <w:spacing w:after="200"/>
         <w:numPr>
@@ -7347,10 +7067,6 @@
           <w:right w:val="nil"/>
           <w:between w:val="nil"/>
         </w:pBdr>
-        <w:rPr>
-          <w:rFonts w:ascii="Inter" w:eastAsia="Inter" w:hAnsi="Inter" w:cs="Inter"/>
-          <w:color w:val="000000"/>
-        </w:rPr>
         <w:jc w:val="left"/>
         <w:spacing w:after="200"/>
         <w:numPr>
@@ -7475,12 +7191,6 @@
           <w:right w:val="nil"/>
           <w:between w:val="nil"/>
         </w:pBdr>
-        <w:rPr>
-          <w:rFonts w:ascii="Inter" w:eastAsia="Inter" w:hAnsi="Inter" w:cs="Inter"/>
-          <w:b/>
-          <w:bCs/>
-          <w:color w:val="000000"/>
-        </w:rPr>
         <w:jc w:val="left"/>
         <w:spacing w:after="200"/>
         <w:numPr>
@@ -7511,12 +7221,6 @@
           <w:right w:val="nil"/>
           <w:between w:val="nil"/>
         </w:pBdr>
-        <w:rPr>
-          <w:rFonts w:ascii="Inter" w:eastAsia="Inter" w:hAnsi="Inter" w:cs="Inter"/>
-          <w:b/>
-          <w:bCs/>
-          <w:color w:val="000000"/>
-        </w:rPr>
         <w:jc w:val="left"/>
         <w:spacing w:after="200"/>
         <w:numPr>
@@ -7707,10 +7411,6 @@
           <w:right w:val="nil"/>
           <w:between w:val="nil"/>
         </w:pBdr>
-        <w:rPr>
-          <w:rFonts w:ascii="Inter" w:eastAsia="Inter" w:hAnsi="Inter" w:cs="Inter"/>
-          <w:color w:val="000000"/>
-        </w:rPr>
         <w:jc w:val="left"/>
         <w:spacing w:after="200"/>
         <w:numPr>
@@ -7809,10 +7509,6 @@
           <w:right w:val="nil"/>
           <w:between w:val="nil"/>
         </w:pBdr>
-        <w:rPr>
-          <w:rFonts w:ascii="Inter" w:eastAsia="Inter" w:hAnsi="Inter" w:cs="Inter"/>
-          <w:color w:val="000000"/>
-        </w:rPr>
         <w:jc w:val="left"/>
         <w:spacing w:after="200"/>
         <w:numPr>
@@ -7961,10 +7657,6 @@
           <w:right w:val="nil"/>
           <w:between w:val="nil"/>
         </w:pBdr>
-        <w:rPr>
-          <w:rFonts w:ascii="Inter" w:eastAsia="Inter" w:hAnsi="Inter" w:cs="Inter"/>
-          <w:color w:val="000000"/>
-        </w:rPr>
         <w:jc w:val="left"/>
         <w:spacing w:after="200"/>
         <w:numPr>
@@ -8133,10 +7825,6 @@
           <w:right w:val="nil"/>
           <w:between w:val="nil"/>
         </w:pBdr>
-        <w:rPr>
-          <w:rFonts w:ascii="Inter" w:eastAsia="Inter" w:hAnsi="Inter" w:cs="Inter"/>
-          <w:color w:val="000000"/>
-        </w:rPr>
         <w:jc w:val="left"/>
         <w:spacing w:after="200"/>
         <w:numPr>
@@ -8305,10 +7993,6 @@
           <w:right w:val="nil"/>
           <w:between w:val="nil"/>
         </w:pBdr>
-        <w:rPr>
-          <w:rFonts w:ascii="Inter" w:eastAsia="Inter" w:hAnsi="Inter" w:cs="Inter"/>
-          <w:color w:val="000000"/>
-        </w:rPr>
         <w:jc w:val="left"/>
         <w:spacing w:after="200"/>
         <w:numPr>
@@ -8472,10 +8156,6 @@
           <w:right w:val="nil"/>
           <w:between w:val="nil"/>
         </w:pBdr>
-        <w:rPr>
-          <w:rFonts w:ascii="Inter" w:eastAsia="Inter" w:hAnsi="Inter" w:cs="Inter"/>
-          <w:color w:val="000000"/>
-        </w:rPr>
         <w:jc w:val="left"/>
         <w:spacing w:after="200"/>
         <w:numPr>
@@ -8535,10 +8215,6 @@
           <w:right w:val="nil"/>
           <w:between w:val="nil"/>
         </w:pBdr>
-        <w:rPr>
-          <w:rFonts w:ascii="Inter" w:eastAsia="Inter" w:hAnsi="Inter" w:cs="Inter"/>
-          <w:color w:val="000000"/>
-        </w:rPr>
         <w:jc w:val="left"/>
         <w:spacing w:after="200"/>
         <w:numPr>
@@ -8676,12 +8352,6 @@
           <w:right w:val="nil"/>
           <w:between w:val="nil"/>
         </w:pBdr>
-        <w:rPr>
-          <w:rFonts w:ascii="Inter" w:eastAsia="Inter" w:hAnsi="Inter" w:cs="Inter"/>
-          <w:b/>
-          <w:bCs/>
-          <w:color w:val="000000"/>
-        </w:rPr>
         <w:jc w:val="left"/>
         <w:spacing w:after="200"/>
         <w:numPr>
@@ -9547,14 +9217,6 @@
           <w:right w:val="nil"/>
           <w:between w:val="nil"/>
         </w:pBdr>
-        <w:rPr>
-          <w:rFonts w:ascii="Bricolage Grotesque" w:eastAsia="Bricolage Grotesque" w:hAnsi="Bricolage Grotesque" w:cs="Bricolage Grotesque"/>
-          <w:b/>
-          <w:bCs/>
-          <w:color w:val="000000"/>
-          <w:sz w:val="24"/>
-          <w:szCs w:val="24"/>
-        </w:rPr>
         <w:jc w:val="left"/>
         <w:spacing w:after="200"/>
         <w:numPr>
@@ -9694,10 +9356,6 @@
           <w:right w:val="nil"/>
           <w:between w:val="nil"/>
         </w:pBdr>
-        <w:rPr>
-          <w:rFonts w:ascii="Inter" w:eastAsia="Inter" w:hAnsi="Inter" w:cs="Inter"/>
-          <w:color w:val="000000"/>
-        </w:rPr>
         <w:jc w:val="left"/>
         <w:spacing w:after="200"/>
         <w:numPr>
@@ -9837,10 +9495,6 @@
           <w:right w:val="nil"/>
           <w:between w:val="nil"/>
         </w:pBdr>
-        <w:rPr>
-          <w:rFonts w:ascii="Inter" w:eastAsia="Inter" w:hAnsi="Inter" w:cs="Inter"/>
-          <w:color w:val="000000"/>
-        </w:rPr>
         <w:jc w:val="left"/>
         <w:spacing w:after="200"/>
         <w:numPr>
@@ -9980,10 +9634,6 @@
           <w:right w:val="nil"/>
           <w:between w:val="nil"/>
         </w:pBdr>
-        <w:rPr>
-          <w:rFonts w:ascii="Inter" w:eastAsia="Inter" w:hAnsi="Inter" w:cs="Inter"/>
-          <w:color w:val="000000"/>
-        </w:rPr>
         <w:jc w:val="left"/>
         <w:spacing w:after="200"/>
         <w:numPr>
@@ -10073,10 +9723,6 @@
           <w:right w:val="nil"/>
           <w:between w:val="nil"/>
         </w:pBdr>
-        <w:rPr>
-          <w:rFonts w:ascii="Inter" w:eastAsia="Inter" w:hAnsi="Inter" w:cs="Inter"/>
-          <w:color w:val="000000"/>
-        </w:rPr>
         <w:jc w:val="left"/>
         <w:spacing w:after="200"/>
         <w:numPr>
@@ -10147,10 +9793,6 @@
           <w:right w:val="nil"/>
           <w:between w:val="nil"/>
         </w:pBdr>
-        <w:rPr>
-          <w:rFonts w:ascii="Inter" w:eastAsia="Inter" w:hAnsi="Inter" w:cs="Inter"/>
-          <w:color w:val="000000"/>
-        </w:rPr>
         <w:jc w:val="left"/>
         <w:spacing w:after="200"/>
         <w:numPr>
@@ -10219,10 +9861,6 @@
           <w:right w:val="nil"/>
           <w:between w:val="nil"/>
         </w:pBdr>
-        <w:rPr>
-          <w:rFonts w:ascii="Inter" w:eastAsia="Inter" w:hAnsi="Inter" w:cs="Inter"/>
-          <w:color w:val="000000"/>
-        </w:rPr>
         <w:jc w:val="left"/>
         <w:spacing w:after="200"/>
         <w:numPr>
@@ -10291,10 +9929,6 @@
           <w:right w:val="nil"/>
           <w:between w:val="nil"/>
         </w:pBdr>
-        <w:rPr>
-          <w:rFonts w:ascii="Inter" w:eastAsia="Inter" w:hAnsi="Inter" w:cs="Inter"/>
-          <w:color w:val="000000"/>
-        </w:rPr>
         <w:jc w:val="left"/>
         <w:spacing w:after="200"/>
         <w:numPr>
@@ -10374,10 +10008,6 @@
           <w:right w:val="nil"/>
           <w:between w:val="nil"/>
         </w:pBdr>
-        <w:rPr>
-          <w:rFonts w:ascii="Inter" w:eastAsia="Inter" w:hAnsi="Inter" w:cs="Inter"/>
-          <w:color w:val="000000"/>
-        </w:rPr>
         <w:jc w:val="left"/>
         <w:spacing w:after="200"/>
         <w:numPr>
@@ -10417,10 +10047,6 @@
           <w:right w:val="nil"/>
           <w:between w:val="nil"/>
         </w:pBdr>
-        <w:rPr>
-          <w:rFonts w:ascii="Inter" w:eastAsia="Inter" w:hAnsi="Inter" w:cs="Inter"/>
-          <w:color w:val="000000"/>
-        </w:rPr>
         <w:jc w:val="left"/>
         <w:spacing w:after="200"/>
         <w:numPr>
@@ -10480,10 +10106,6 @@
           <w:right w:val="nil"/>
           <w:between w:val="nil"/>
         </w:pBdr>
-        <w:rPr>
-          <w:rFonts w:ascii="Inter" w:eastAsia="Inter" w:hAnsi="Inter" w:cs="Inter"/>
-          <w:color w:val="000000"/>
-        </w:rPr>
         <w:jc w:val="left"/>
         <w:spacing w:after="200"/>
         <w:numPr>
@@ -10543,10 +10165,6 @@
           <w:right w:val="nil"/>
           <w:between w:val="nil"/>
         </w:pBdr>
-        <w:rPr>
-          <w:rFonts w:ascii="Inter" w:eastAsia="Inter" w:hAnsi="Inter" w:cs="Inter"/>
-          <w:color w:val="000000"/>
-        </w:rPr>
         <w:jc w:val="left"/>
         <w:spacing w:after="200"/>
         <w:numPr>
@@ -10626,10 +10244,6 @@
           <w:right w:val="nil"/>
           <w:between w:val="nil"/>
         </w:pBdr>
-        <w:rPr>
-          <w:rFonts w:ascii="Inter" w:eastAsia="Inter" w:hAnsi="Inter" w:cs="Inter"/>
-          <w:color w:val="000000"/>
-        </w:rPr>
         <w:jc w:val="left"/>
         <w:spacing w:after="200"/>
         <w:numPr>
@@ -10738,10 +10352,6 @@
           <w:right w:val="nil"/>
           <w:between w:val="nil"/>
         </w:pBdr>
-        <w:rPr>
-          <w:rFonts w:ascii="Inter" w:eastAsia="Inter" w:hAnsi="Inter" w:cs="Inter"/>
-          <w:color w:val="000000"/>
-        </w:rPr>
         <w:jc w:val="left"/>
         <w:spacing w:after="200"/>
         <w:numPr>
@@ -10850,10 +10460,6 @@
           <w:right w:val="nil"/>
           <w:between w:val="nil"/>
         </w:pBdr>
-        <w:rPr>
-          <w:rFonts w:ascii="Inter" w:eastAsia="Inter" w:hAnsi="Inter" w:cs="Inter"/>
-          <w:color w:val="000000"/>
-        </w:rPr>
         <w:jc w:val="left"/>
         <w:spacing w:after="200"/>
         <w:numPr>
@@ -10913,10 +10519,6 @@
           <w:right w:val="nil"/>
           <w:between w:val="nil"/>
         </w:pBdr>
-        <w:rPr>
-          <w:rFonts w:ascii="Inter" w:eastAsia="Inter" w:hAnsi="Inter" w:cs="Inter"/>
-          <w:color w:val="000000"/>
-        </w:rPr>
         <w:jc w:val="left"/>
         <w:spacing w:after="200"/>
         <w:numPr>
@@ -11026,10 +10628,6 @@
           <w:right w:val="nil"/>
           <w:between w:val="nil"/>
         </w:pBdr>
-        <w:rPr>
-          <w:rFonts w:ascii="Inter" w:eastAsia="Inter" w:hAnsi="Inter" w:cs="Inter"/>
-          <w:color w:val="000000"/>
-        </w:rPr>
         <w:jc w:val="left"/>
         <w:spacing w:after="200"/>
         <w:numPr>
@@ -11069,10 +10667,6 @@
           <w:right w:val="nil"/>
           <w:between w:val="nil"/>
         </w:pBdr>
-        <w:rPr>
-          <w:rFonts w:ascii="Inter" w:eastAsia="Inter" w:hAnsi="Inter" w:cs="Inter"/>
-          <w:color w:val="000000"/>
-        </w:rPr>
         <w:jc w:val="left"/>
         <w:spacing w:after="200"/>
         <w:numPr>
@@ -11101,10 +10695,6 @@
           <w:right w:val="nil"/>
           <w:between w:val="nil"/>
         </w:pBdr>
-        <w:rPr>
-          <w:rFonts w:ascii="Inter" w:eastAsia="Inter" w:hAnsi="Inter" w:cs="Inter"/>
-          <w:color w:val="000000"/>
-        </w:rPr>
         <w:jc w:val="left"/>
         <w:spacing w:after="200"/>
         <w:numPr>
@@ -11202,10 +10792,6 @@
           <w:right w:val="nil"/>
           <w:between w:val="nil"/>
         </w:pBdr>
-        <w:rPr>
-          <w:rFonts w:ascii="Inter" w:eastAsia="Inter" w:hAnsi="Inter" w:cs="Inter"/>
-          <w:color w:val="000000"/>
-        </w:rPr>
         <w:jc w:val="left"/>
         <w:spacing w:after="200"/>
         <w:numPr>
@@ -11365,10 +10951,6 @@
           <w:right w:val="nil"/>
           <w:between w:val="nil"/>
         </w:pBdr>
-        <w:rPr>
-          <w:rFonts w:ascii="Inter" w:eastAsia="Inter" w:hAnsi="Inter" w:cs="Inter"/>
-          <w:color w:val="000000"/>
-        </w:rPr>
         <w:jc w:val="left"/>
         <w:spacing w:after="200"/>
         <w:numPr>
@@ -11408,10 +10990,6 @@
           <w:right w:val="nil"/>
           <w:between w:val="nil"/>
         </w:pBdr>
-        <w:rPr>
-          <w:rFonts w:ascii="Inter" w:eastAsia="Inter" w:hAnsi="Inter" w:cs="Inter"/>
-          <w:color w:val="000000"/>
-        </w:rPr>
         <w:jc w:val="left"/>
         <w:spacing w:after="200"/>
         <w:numPr>
@@ -11471,10 +11049,6 @@
           <w:right w:val="nil"/>
           <w:between w:val="nil"/>
         </w:pBdr>
-        <w:rPr>
-          <w:rFonts w:ascii="Inter" w:eastAsia="Inter" w:hAnsi="Inter" w:cs="Inter"/>
-          <w:color w:val="000000"/>
-        </w:rPr>
         <w:jc w:val="left"/>
         <w:spacing w:after="200"/>
         <w:numPr>
@@ -11514,10 +11088,6 @@
           <w:right w:val="nil"/>
           <w:between w:val="nil"/>
         </w:pBdr>
-        <w:rPr>
-          <w:rFonts w:ascii="Inter" w:eastAsia="Inter" w:hAnsi="Inter" w:cs="Inter"/>
-          <w:color w:val="000000"/>
-        </w:rPr>
         <w:jc w:val="left"/>
         <w:spacing w:after="200"/>
         <w:numPr>
@@ -11596,10 +11166,6 @@
           <w:right w:val="nil"/>
           <w:between w:val="nil"/>
         </w:pBdr>
-        <w:rPr>
-          <w:rFonts w:ascii="Inter" w:eastAsia="Inter" w:hAnsi="Inter" w:cs="Inter"/>
-          <w:color w:val="000000"/>
-        </w:rPr>
         <w:jc w:val="left"/>
         <w:spacing w:after="200"/>
         <w:numPr>
@@ -11699,10 +11265,6 @@
           <w:right w:val="nil"/>
           <w:between w:val="nil"/>
         </w:pBdr>
-        <w:rPr>
-          <w:rFonts w:ascii="Inter" w:eastAsia="Inter" w:hAnsi="Inter" w:cs="Inter"/>
-          <w:color w:val="000000"/>
-        </w:rPr>
         <w:jc w:val="left"/>
         <w:spacing w:after="200"/>
         <w:numPr>
@@ -11742,10 +11304,6 @@
           <w:right w:val="nil"/>
           <w:between w:val="nil"/>
         </w:pBdr>
-        <w:rPr>
-          <w:rFonts w:ascii="Inter" w:eastAsia="Inter" w:hAnsi="Inter" w:cs="Inter"/>
-          <w:color w:val="000000"/>
-        </w:rPr>
         <w:jc w:val="left"/>
         <w:spacing w:after="200"/>
         <w:numPr>
@@ -11785,10 +11343,6 @@
           <w:right w:val="nil"/>
           <w:between w:val="nil"/>
         </w:pBdr>
-        <w:rPr>
-          <w:rFonts w:ascii="Inter" w:eastAsia="Inter" w:hAnsi="Inter" w:cs="Inter"/>
-          <w:color w:val="000000"/>
-        </w:rPr>
         <w:jc w:val="left"/>
         <w:spacing w:after="200"/>
         <w:numPr>
@@ -11828,10 +11382,6 @@
           <w:right w:val="nil"/>
           <w:between w:val="nil"/>
         </w:pBdr>
-        <w:rPr>
-          <w:rFonts w:ascii="Inter" w:eastAsia="Inter" w:hAnsi="Inter" w:cs="Inter"/>
-          <w:color w:val="000000"/>
-        </w:rPr>
         <w:jc w:val="left"/>
         <w:spacing w:after="200"/>
         <w:numPr>
@@ -11891,10 +11441,6 @@
           <w:right w:val="nil"/>
           <w:between w:val="nil"/>
         </w:pBdr>
-        <w:rPr>
-          <w:rFonts w:ascii="Inter" w:eastAsia="Inter" w:hAnsi="Inter" w:cs="Inter"/>
-          <w:color w:val="000000"/>
-        </w:rPr>
         <w:jc w:val="left"/>
         <w:spacing w:after="200"/>
         <w:numPr>
@@ -11923,10 +11469,6 @@
           <w:right w:val="nil"/>
           <w:between w:val="nil"/>
         </w:pBdr>
-        <w:rPr>
-          <w:rFonts w:ascii="Inter" w:eastAsia="Inter" w:hAnsi="Inter" w:cs="Inter"/>
-          <w:color w:val="000000"/>
-        </w:rPr>
         <w:jc w:val="left"/>
         <w:spacing w:after="200"/>
         <w:numPr>
@@ -11955,10 +11497,6 @@
           <w:right w:val="nil"/>
           <w:between w:val="nil"/>
         </w:pBdr>
-        <w:rPr>
-          <w:rFonts w:ascii="Inter" w:eastAsia="Inter" w:hAnsi="Inter" w:cs="Inter"/>
-          <w:color w:val="000000"/>
-        </w:rPr>
         <w:jc w:val="left"/>
         <w:spacing w:after="200"/>
         <w:numPr>
@@ -12096,10 +11634,6 @@
           <w:right w:val="nil"/>
           <w:between w:val="nil"/>
         </w:pBdr>
-        <w:rPr>
-          <w:rFonts w:ascii="Inter" w:eastAsia="Inter" w:hAnsi="Inter" w:cs="Inter"/>
-          <w:color w:val="000000"/>
-        </w:rPr>
         <w:jc w:val="left"/>
         <w:spacing w:after="200"/>
         <w:numPr>
@@ -12139,10 +11673,6 @@
           <w:right w:val="nil"/>
           <w:between w:val="nil"/>
         </w:pBdr>
-        <w:rPr>
-          <w:rFonts w:ascii="Inter" w:eastAsia="Inter" w:hAnsi="Inter" w:cs="Inter"/>
-          <w:color w:val="000000"/>
-        </w:rPr>
         <w:jc w:val="left"/>
         <w:spacing w:after="200"/>
         <w:numPr>
@@ -12202,10 +11732,6 @@
           <w:right w:val="nil"/>
           <w:between w:val="nil"/>
         </w:pBdr>
-        <w:rPr>
-          <w:rFonts w:ascii="Inter" w:eastAsia="Inter" w:hAnsi="Inter" w:cs="Inter"/>
-          <w:color w:val="000000"/>
-        </w:rPr>
         <w:jc w:val="left"/>
         <w:spacing w:after="200"/>
         <w:numPr>
@@ -12276,10 +11802,6 @@
           <w:right w:val="nil"/>
           <w:between w:val="nil"/>
         </w:pBdr>
-        <w:rPr>
-          <w:rFonts w:ascii="Inter" w:eastAsia="Inter" w:hAnsi="Inter" w:cs="Inter"/>
-          <w:color w:val="000000"/>
-        </w:rPr>
         <w:jc w:val="left"/>
         <w:spacing w:after="200"/>
         <w:numPr>
@@ -12308,10 +11830,6 @@
           <w:right w:val="nil"/>
           <w:between w:val="nil"/>
         </w:pBdr>
-        <w:rPr>
-          <w:rFonts w:ascii="Inter" w:eastAsia="Inter" w:hAnsi="Inter" w:cs="Inter"/>
-          <w:color w:val="000000"/>
-        </w:rPr>
         <w:jc w:val="left"/>
         <w:spacing w:after="200"/>
         <w:numPr>
@@ -12340,10 +11858,6 @@
           <w:right w:val="nil"/>
           <w:between w:val="nil"/>
         </w:pBdr>
-        <w:rPr>
-          <w:rFonts w:ascii="Inter" w:eastAsia="Inter" w:hAnsi="Inter" w:cs="Inter"/>
-          <w:color w:val="000000"/>
-        </w:rPr>
         <w:jc w:val="left"/>
         <w:spacing w:after="200"/>
         <w:numPr>
@@ -12372,10 +11886,6 @@
           <w:right w:val="nil"/>
           <w:between w:val="nil"/>
         </w:pBdr>
-        <w:rPr>
-          <w:rFonts w:ascii="Inter" w:eastAsia="Inter" w:hAnsi="Inter" w:cs="Inter"/>
-          <w:color w:val="000000"/>
-        </w:rPr>
         <w:jc w:val="left"/>
         <w:spacing w:after="200"/>
         <w:numPr>
@@ -12404,14 +11914,6 @@
           <w:right w:val="nil"/>
           <w:between w:val="nil"/>
         </w:pBdr>
-        <w:rPr>
-          <w:rFonts w:ascii="Bricolage Grotesque" w:eastAsia="Bricolage Grotesque" w:hAnsi="Bricolage Grotesque" w:cs="Bricolage Grotesque"/>
-          <w:b/>
-          <w:bCs/>
-          <w:color w:val="000000"/>
-          <w:sz w:val="28"/>
-          <w:szCs w:val="28"/>
-        </w:rPr>
         <w:jc w:val="left"/>
         <w:spacing w:after="200"/>
         <w:numPr>
@@ -12551,10 +12053,6 @@
           <w:right w:val="nil"/>
           <w:between w:val="nil"/>
         </w:pBdr>
-        <w:rPr>
-          <w:rFonts w:ascii="Inter" w:eastAsia="Inter" w:hAnsi="Inter" w:cs="Inter"/>
-          <w:color w:val="000000"/>
-        </w:rPr>
         <w:jc w:val="left"/>
         <w:spacing w:after="200"/>
         <w:numPr>
@@ -12674,12 +12172,6 @@
           <w:right w:val="nil"/>
           <w:between w:val="nil"/>
         </w:pBdr>
-        <w:rPr>
-          <w:rFonts w:ascii="Inter" w:eastAsia="Inter" w:hAnsi="Inter" w:cs="Inter"/>
-          <w:b/>
-          <w:bCs/>
-          <w:color w:val="000000"/>
-        </w:rPr>
         <w:jc w:val="left"/>
         <w:spacing w:after="200"/>
         <w:numPr>
@@ -12937,10 +12429,6 @@
           <w:right w:val="nil"/>
           <w:between w:val="nil"/>
         </w:pBdr>
-        <w:rPr>
-          <w:rFonts w:ascii="Inter" w:eastAsia="Inter" w:hAnsi="Inter" w:cs="Inter"/>
-          <w:color w:val="000000"/>
-        </w:rPr>
         <w:jc w:val="left"/>
         <w:spacing w:after="200"/>
         <w:numPr>
@@ -13471,10 +12959,6 @@
           <w:right w:val="nil"/>
           <w:between w:val="nil"/>
         </w:pBdr>
-        <w:rPr>
-          <w:rFonts w:ascii="Inter" w:eastAsia="Inter" w:hAnsi="Inter" w:cs="Inter"/>
-          <w:color w:val="000000"/>
-        </w:rPr>
         <w:jc w:val="left"/>
         <w:spacing w:after="200"/>
         <w:numPr>
@@ -13672,10 +13156,6 @@
           <w:right w:val="nil"/>
           <w:between w:val="nil"/>
         </w:pBdr>
-        <w:rPr>
-          <w:rFonts w:ascii="Inter" w:eastAsia="Inter" w:hAnsi="Inter" w:cs="Inter"/>
-          <w:color w:val="000000"/>
-        </w:rPr>
         <w:jc w:val="left"/>
         <w:spacing w:after="200"/>
         <w:numPr>
@@ -14357,10 +13837,6 @@
           <w:right w:val="nil"/>
           <w:between w:val="nil"/>
         </w:pBdr>
-        <w:rPr>
-          <w:rFonts w:ascii="Inter" w:eastAsia="Inter" w:hAnsi="Inter" w:cs="Inter"/>
-          <w:color w:val="000000"/>
-        </w:rPr>
         <w:jc w:val="left"/>
         <w:spacing w:after="200"/>
         <w:numPr>
@@ -14440,10 +13916,6 @@
           <w:right w:val="nil"/>
           <w:between w:val="nil"/>
         </w:pBdr>
-        <w:rPr>
-          <w:rFonts w:ascii="Inter" w:eastAsia="Inter" w:hAnsi="Inter" w:cs="Inter"/>
-          <w:color w:val="000000"/>
-        </w:rPr>
         <w:jc w:val="left"/>
         <w:spacing w:after="200"/>
         <w:numPr>
@@ -14523,10 +13995,6 @@
           <w:right w:val="nil"/>
           <w:between w:val="nil"/>
         </w:pBdr>
-        <w:rPr>
-          <w:rFonts w:ascii="Inter" w:eastAsia="Inter" w:hAnsi="Inter" w:cs="Inter"/>
-          <w:color w:val="000000"/>
-        </w:rPr>
         <w:jc w:val="left"/>
         <w:spacing w:after="200"/>
         <w:numPr>
@@ -14768,10 +14236,6 @@
           <w:right w:val="nil"/>
           <w:between w:val="nil"/>
         </w:pBdr>
-        <w:rPr>
-          <w:rFonts w:ascii="Inter" w:eastAsia="Inter" w:hAnsi="Inter" w:cs="Inter"/>
-          <w:color w:val="000000"/>
-        </w:rPr>
         <w:jc w:val="left"/>
         <w:spacing w:after="200"/>
         <w:numPr>
@@ -14811,10 +14275,6 @@
           <w:right w:val="nil"/>
           <w:between w:val="nil"/>
         </w:pBdr>
-        <w:rPr>
-          <w:rFonts w:ascii="Inter" w:eastAsia="Inter" w:hAnsi="Inter" w:cs="Inter"/>
-          <w:color w:val="000000"/>
-        </w:rPr>
         <w:jc w:val="left"/>
         <w:spacing w:after="200"/>
         <w:numPr>
@@ -14954,10 +14414,6 @@
           <w:right w:val="nil"/>
           <w:between w:val="nil"/>
         </w:pBdr>
-        <w:rPr>
-          <w:rFonts w:ascii="Inter" w:eastAsia="Inter" w:hAnsi="Inter" w:cs="Inter"/>
-          <w:color w:val="000000"/>
-        </w:rPr>
         <w:jc w:val="left"/>
         <w:spacing w:after="200"/>
         <w:numPr>
@@ -15037,14 +14493,6 @@
           <w:right w:val="nil"/>
           <w:between w:val="nil"/>
         </w:pBdr>
-        <w:rPr>
-          <w:rFonts w:ascii="Bricolage Grotesque" w:eastAsia="Bricolage Grotesque" w:hAnsi="Bricolage Grotesque" w:cs="Bricolage Grotesque"/>
-          <w:b/>
-          <w:bCs/>
-          <w:color w:val="000000"/>
-          <w:sz w:val="28"/>
-          <w:szCs w:val="28"/>
-        </w:rPr>
         <w:jc w:val="left"/>
         <w:spacing w:after="200"/>
         <w:numPr>
@@ -15164,10 +14612,6 @@
           <w:right w:val="nil"/>
           <w:between w:val="nil"/>
         </w:pBdr>
-        <w:rPr>
-          <w:rFonts w:ascii="Inter" w:eastAsia="Inter" w:hAnsi="Inter" w:cs="Inter"/>
-          <w:color w:val="000000"/>
-        </w:rPr>
         <w:jc w:val="left"/>
         <w:spacing w:after="200"/>
         <w:numPr>
@@ -15263,10 +14707,6 @@
           <w:right w:val="nil"/>
           <w:between w:val="nil"/>
         </w:pBdr>
-        <w:rPr>
-          <w:rFonts w:ascii="Inter" w:eastAsia="Inter" w:hAnsi="Inter" w:cs="Inter"/>
-          <w:color w:val="000000"/>
-        </w:rPr>
         <w:jc w:val="left"/>
         <w:spacing w:after="200"/>
         <w:numPr>
@@ -15326,10 +14766,6 @@
           <w:right w:val="nil"/>
           <w:between w:val="nil"/>
         </w:pBdr>
-        <w:rPr>
-          <w:rFonts w:ascii="Inter" w:eastAsia="Inter" w:hAnsi="Inter" w:cs="Inter"/>
-          <w:color w:val="000000"/>
-        </w:rPr>
         <w:jc w:val="left"/>
         <w:spacing w:after="200"/>
         <w:numPr>
@@ -15389,10 +14825,6 @@
           <w:right w:val="nil"/>
           <w:between w:val="nil"/>
         </w:pBdr>
-        <w:rPr>
-          <w:rFonts w:ascii="Inter" w:eastAsia="Inter" w:hAnsi="Inter" w:cs="Inter"/>
-          <w:color w:val="000000"/>
-        </w:rPr>
         <w:jc w:val="left"/>
         <w:spacing w:after="200"/>
         <w:numPr>
@@ -15452,10 +14884,6 @@
           <w:right w:val="nil"/>
           <w:between w:val="nil"/>
         </w:pBdr>
-        <w:rPr>
-          <w:rFonts w:ascii="Inter" w:eastAsia="Inter" w:hAnsi="Inter" w:cs="Inter"/>
-          <w:color w:val="000000"/>
-        </w:rPr>
         <w:jc w:val="left"/>
         <w:spacing w:after="200"/>
         <w:numPr>
@@ -15535,10 +14963,6 @@
           <w:right w:val="nil"/>
           <w:between w:val="nil"/>
         </w:pBdr>
-        <w:rPr>
-          <w:rFonts w:ascii="Inter" w:eastAsia="Inter" w:hAnsi="Inter" w:cs="Inter"/>
-          <w:color w:val="000000"/>
-        </w:rPr>
         <w:jc w:val="left"/>
         <w:spacing w:after="200"/>
         <w:numPr>
@@ -15769,10 +15193,6 @@
           <w:right w:val="nil"/>
           <w:between w:val="nil"/>
         </w:pBdr>
-        <w:rPr>
-          <w:rFonts w:ascii="Inter" w:eastAsia="Inter" w:hAnsi="Inter" w:cs="Inter"/>
-          <w:color w:val="000000"/>
-        </w:rPr>
         <w:jc w:val="left"/>
         <w:spacing w:after="200"/>
         <w:numPr>
@@ -15832,10 +15252,6 @@
           <w:right w:val="nil"/>
           <w:between w:val="nil"/>
         </w:pBdr>
-        <w:rPr>
-          <w:rFonts w:ascii="Inter" w:eastAsia="Inter" w:hAnsi="Inter" w:cs="Inter"/>
-          <w:color w:val="000000"/>
-        </w:rPr>
         <w:jc w:val="left"/>
         <w:spacing w:after="200"/>
         <w:numPr>
@@ -15885,14 +15301,6 @@
           <w:right w:val="nil"/>
           <w:between w:val="nil"/>
         </w:pBdr>
-        <w:rPr>
-          <w:rFonts w:ascii="Bricolage Grotesque" w:eastAsia="Bricolage Grotesque" w:hAnsi="Bricolage Grotesque" w:cs="Bricolage Grotesque"/>
-          <w:b/>
-          <w:bCs/>
-          <w:color w:val="000000"/>
-          <w:sz w:val="28"/>
-          <w:szCs w:val="28"/>
-        </w:rPr>
         <w:jc w:val="left"/>
         <w:spacing w:after="200"/>
         <w:numPr>
@@ -15972,10 +15380,6 @@
           <w:right w:val="nil"/>
           <w:between w:val="nil"/>
         </w:pBdr>
-        <w:rPr>
-          <w:rFonts w:ascii="Inter" w:eastAsia="Inter" w:hAnsi="Inter" w:cs="Inter"/>
-          <w:color w:val="000000"/>
-        </w:rPr>
         <w:jc w:val="left"/>
         <w:spacing w:after="200"/>
         <w:numPr>
@@ -16122,10 +15526,6 @@
           <w:right w:val="nil"/>
           <w:between w:val="nil"/>
         </w:pBdr>
-        <w:rPr>
-          <w:rFonts w:ascii="Inter" w:eastAsia="Inter" w:hAnsi="Inter" w:cs="Inter"/>
-          <w:color w:val="000000"/>
-        </w:rPr>
         <w:jc w:val="left"/>
         <w:spacing w:after="200"/>
         <w:numPr>
@@ -16303,10 +15703,6 @@
           <w:right w:val="nil"/>
           <w:between w:val="nil"/>
         </w:pBdr>
-        <w:rPr>
-          <w:rFonts w:ascii="Inter" w:eastAsia="Inter" w:hAnsi="Inter" w:cs="Inter"/>
-          <w:color w:val="000000"/>
-        </w:rPr>
         <w:jc w:val="left"/>
         <w:spacing w:after="200"/>
         <w:numPr>
@@ -16435,10 +15831,6 @@
           <w:right w:val="nil"/>
           <w:between w:val="nil"/>
         </w:pBdr>
-        <w:rPr>
-          <w:rFonts w:ascii="Inter" w:eastAsia="Inter" w:hAnsi="Inter" w:cs="Inter"/>
-          <w:color w:val="000000"/>
-        </w:rPr>
         <w:jc w:val="left"/>
         <w:spacing w:after="200"/>
         <w:numPr>
@@ -16866,10 +16258,6 @@
           <w:right w:val="nil"/>
           <w:between w:val="nil"/>
         </w:pBdr>
-        <w:rPr>
-          <w:rFonts w:ascii="Inter" w:eastAsia="Inter" w:hAnsi="Inter" w:cs="Inter"/>
-          <w:color w:val="000000"/>
-        </w:rPr>
         <w:jc w:val="left"/>
         <w:spacing w:after="200"/>
         <w:numPr>
@@ -17038,10 +16426,6 @@
           <w:right w:val="nil"/>
           <w:between w:val="nil"/>
         </w:pBdr>
-        <w:rPr>
-          <w:rFonts w:ascii="Inter" w:eastAsia="Inter" w:hAnsi="Inter" w:cs="Inter"/>
-          <w:color w:val="000000"/>
-        </w:rPr>
         <w:jc w:val="left"/>
         <w:spacing w:after="200"/>
         <w:numPr>
@@ -17157,10 +16541,6 @@
           <w:right w:val="nil"/>
           <w:between w:val="nil"/>
         </w:pBdr>
-        <w:rPr>
-          <w:rFonts w:ascii="Inter" w:eastAsia="Inter" w:hAnsi="Inter" w:cs="Inter"/>
-          <w:color w:val="000000"/>
-        </w:rPr>
         <w:jc w:val="left"/>
         <w:spacing w:after="200"/>
         <w:numPr>
@@ -17380,10 +16760,6 @@
           <w:right w:val="nil"/>
           <w:between w:val="nil"/>
         </w:pBdr>
-        <w:rPr>
-          <w:rFonts w:ascii="Inter" w:eastAsia="Inter" w:hAnsi="Inter" w:cs="Inter"/>
-          <w:color w:val="000000"/>
-        </w:rPr>
         <w:jc w:val="left"/>
         <w:spacing w:after="200"/>
         <w:numPr>
@@ -17684,10 +17060,6 @@
           <w:right w:val="nil"/>
           <w:between w:val="nil"/>
         </w:pBdr>
-        <w:rPr>
-          <w:rFonts w:ascii="Inter" w:eastAsia="Inter" w:hAnsi="Inter" w:cs="Inter"/>
-          <w:color w:val="000000"/>
-        </w:rPr>
         <w:jc w:val="left"/>
         <w:spacing w:after="200"/>
         <w:numPr>
@@ -17716,10 +17088,6 @@
           <w:right w:val="nil"/>
           <w:between w:val="nil"/>
         </w:pBdr>
-        <w:rPr>
-          <w:rFonts w:ascii="Inter" w:eastAsia="Inter" w:hAnsi="Inter" w:cs="Inter"/>
-          <w:color w:val="000000"/>
-        </w:rPr>
         <w:jc w:val="left"/>
         <w:spacing w:after="200"/>
         <w:numPr>
@@ -17748,10 +17116,6 @@
           <w:right w:val="nil"/>
           <w:between w:val="nil"/>
         </w:pBdr>
-        <w:rPr>
-          <w:rFonts w:ascii="Inter" w:eastAsia="Inter" w:hAnsi="Inter" w:cs="Inter"/>
-          <w:color w:val="000000"/>
-        </w:rPr>
         <w:jc w:val="left"/>
         <w:spacing w:after="200"/>
         <w:numPr>
@@ -17780,10 +17144,6 @@
           <w:right w:val="nil"/>
           <w:between w:val="nil"/>
         </w:pBdr>
-        <w:rPr>
-          <w:rFonts w:ascii="Inter" w:eastAsia="Inter" w:hAnsi="Inter" w:cs="Inter"/>
-          <w:color w:val="000000"/>
-        </w:rPr>
         <w:jc w:val="left"/>
         <w:spacing w:after="200"/>
         <w:numPr>
@@ -17812,10 +17172,6 @@
           <w:right w:val="nil"/>
           <w:between w:val="nil"/>
         </w:pBdr>
-        <w:rPr>
-          <w:rFonts w:ascii="Inter" w:eastAsia="Inter" w:hAnsi="Inter" w:cs="Inter"/>
-          <w:color w:val="000000"/>
-        </w:rPr>
         <w:jc w:val="left"/>
         <w:spacing w:after="200"/>
         <w:numPr>
@@ -17844,10 +17200,6 @@
           <w:right w:val="nil"/>
           <w:between w:val="nil"/>
         </w:pBdr>
-        <w:rPr>
-          <w:rFonts w:ascii="Inter" w:eastAsia="Inter" w:hAnsi="Inter" w:cs="Inter"/>
-          <w:color w:val="000000"/>
-        </w:rPr>
         <w:jc w:val="left"/>
         <w:spacing w:after="200"/>
         <w:numPr>
@@ -17896,12 +17248,6 @@
           <w:right w:val="nil"/>
           <w:between w:val="nil"/>
         </w:pBdr>
-        <w:rPr>
-          <w:rFonts w:ascii="Inter" w:eastAsia="Inter" w:hAnsi="Inter" w:cs="Inter"/>
-          <w:b/>
-          <w:bCs/>
-          <w:color w:val="000000"/>
-        </w:rPr>
         <w:jc w:val="left"/>
         <w:spacing w:after="200"/>
         <w:numPr>
@@ -17932,10 +17278,6 @@
           <w:right w:val="nil"/>
           <w:between w:val="nil"/>
         </w:pBdr>
-        <w:rPr>
-          <w:rFonts w:ascii="Inter" w:eastAsia="Inter" w:hAnsi="Inter" w:cs="Inter"/>
-          <w:color w:val="000000"/>
-        </w:rPr>
         <w:jc w:val="left"/>
         <w:spacing w:after="200"/>
         <w:numPr>
@@ -18084,10 +17426,6 @@
           <w:right w:val="nil"/>
           <w:between w:val="nil"/>
         </w:pBdr>
-        <w:rPr>
-          <w:rFonts w:ascii="Inter" w:eastAsia="Inter" w:hAnsi="Inter" w:cs="Inter"/>
-          <w:color w:val="000000"/>
-        </w:rPr>
         <w:jc w:val="left"/>
         <w:spacing w:after="200"/>
         <w:numPr>
@@ -18276,10 +17614,6 @@
           <w:right w:val="nil"/>
           <w:between w:val="nil"/>
         </w:pBdr>
-        <w:rPr>
-          <w:rFonts w:ascii="Inter" w:eastAsia="Inter" w:hAnsi="Inter" w:cs="Inter"/>
-          <w:color w:val="000000"/>
-        </w:rPr>
         <w:jc w:val="left"/>
         <w:spacing w:after="200"/>
         <w:numPr>
@@ -18530,10 +17864,6 @@
           <w:right w:val="nil"/>
           <w:between w:val="nil"/>
         </w:pBdr>
-        <w:rPr>
-          <w:rFonts w:ascii="Inter" w:eastAsia="Inter" w:hAnsi="Inter" w:cs="Inter"/>
-          <w:color w:val="000000"/>
-        </w:rPr>
         <w:jc w:val="left"/>
         <w:spacing w:after="200"/>
         <w:numPr>
@@ -18613,10 +17943,6 @@
           <w:right w:val="nil"/>
           <w:between w:val="nil"/>
         </w:pBdr>
-        <w:rPr>
-          <w:rFonts w:ascii="Inter" w:eastAsia="Inter" w:hAnsi="Inter" w:cs="Inter"/>
-          <w:color w:val="000000"/>
-        </w:rPr>
         <w:jc w:val="left"/>
         <w:spacing w:after="200"/>
         <w:numPr>
@@ -19244,10 +18570,6 @@
           <w:right w:val="nil"/>
           <w:between w:val="nil"/>
         </w:pBdr>
-        <w:rPr>
-          <w:rFonts w:ascii="Inter" w:eastAsia="Inter" w:hAnsi="Inter" w:cs="Inter"/>
-          <w:color w:val="000000"/>
-        </w:rPr>
         <w:jc w:val="left"/>
         <w:spacing w:after="200"/>
         <w:numPr>
@@ -19347,10 +18669,6 @@
           <w:right w:val="nil"/>
           <w:between w:val="nil"/>
         </w:pBdr>
-        <w:rPr>
-          <w:rFonts w:ascii="Inter" w:eastAsia="Inter" w:hAnsi="Inter" w:cs="Inter"/>
-          <w:color w:val="000000"/>
-        </w:rPr>
         <w:jc w:val="left"/>
         <w:spacing w:after="200"/>
         <w:numPr>
@@ -19570,10 +18888,6 @@
           <w:right w:val="nil"/>
           <w:between w:val="nil"/>
         </w:pBdr>
-        <w:rPr>
-          <w:rFonts w:ascii="Inter" w:eastAsia="Inter" w:hAnsi="Inter" w:cs="Inter"/>
-          <w:color w:val="000000"/>
-        </w:rPr>
         <w:jc w:val="left"/>
         <w:spacing w:after="200"/>
         <w:numPr>
@@ -19743,10 +19057,6 @@
           <w:right w:val="nil"/>
           <w:between w:val="nil"/>
         </w:pBdr>
-        <w:rPr>
-          <w:rFonts w:ascii="Inter" w:eastAsia="Inter" w:hAnsi="Inter" w:cs="Inter"/>
-          <w:color w:val="000000"/>
-        </w:rPr>
         <w:jc w:val="left"/>
         <w:spacing w:after="200"/>
         <w:numPr>
@@ -19984,10 +19294,6 @@
           <w:right w:val="nil"/>
           <w:between w:val="nil"/>
         </w:pBdr>
-        <w:rPr>
-          <w:rFonts w:ascii="Inter" w:eastAsia="Inter" w:hAnsi="Inter" w:cs="Inter"/>
-          <w:color w:val="000000"/>
-        </w:rPr>
         <w:jc w:val="left"/>
         <w:spacing w:after="200"/>
         <w:numPr>
@@ -20069,10 +19375,6 @@
           <w:right w:val="nil"/>
           <w:between w:val="nil"/>
         </w:pBdr>
-        <w:rPr>
-          <w:rFonts w:ascii="Inter" w:eastAsia="Inter" w:hAnsi="Inter" w:cs="Inter"/>
-          <w:color w:val="000000"/>
-        </w:rPr>
         <w:jc w:val="left"/>
         <w:spacing w:after="200"/>
         <w:numPr>
@@ -20203,10 +19505,6 @@
           <w:right w:val="nil"/>
           <w:between w:val="nil"/>
         </w:pBdr>
-        <w:rPr>
-          <w:rFonts w:ascii="Inter" w:eastAsia="Inter" w:hAnsi="Inter" w:cs="Inter"/>
-          <w:color w:val="000000"/>
-        </w:rPr>
         <w:jc w:val="left"/>
         <w:spacing w:after="200"/>
         <w:numPr>
@@ -20266,12 +19564,6 @@
           <w:right w:val="nil"/>
           <w:between w:val="nil"/>
         </w:pBdr>
-        <w:rPr>
-          <w:rFonts w:ascii="Inter" w:eastAsia="Inter" w:hAnsi="Inter" w:cs="Inter"/>
-          <w:b/>
-          <w:bCs/>
-          <w:color w:val="000000"/>
-        </w:rPr>
         <w:jc w:val="left"/>
         <w:spacing w:after="200"/>
         <w:numPr>
@@ -20302,12 +19594,6 @@
           <w:right w:val="nil"/>
           <w:between w:val="nil"/>
         </w:pBdr>
-        <w:rPr>
-          <w:rFonts w:ascii="Inter" w:eastAsia="Inter" w:hAnsi="Inter" w:cs="Inter"/>
-          <w:b/>
-          <w:bCs/>
-          <w:color w:val="000000"/>
-        </w:rPr>
         <w:jc w:val="left"/>
         <w:spacing w:after="200"/>
         <w:numPr>
@@ -20340,10 +19626,6 @@
           <w:right w:val="nil"/>
           <w:between w:val="nil"/>
         </w:pBdr>
-        <w:rPr>
-          <w:rFonts w:ascii="Inter" w:eastAsia="Inter" w:hAnsi="Inter" w:cs="Inter"/>
-          <w:color w:val="000000"/>
-        </w:rPr>
         <w:jc w:val="left"/>
         <w:spacing w:after="200"/>
         <w:numPr>
@@ -20804,10 +20086,6 @@
           <w:right w:val="nil"/>
           <w:between w:val="nil"/>
         </w:pBdr>
-        <w:rPr>
-          <w:rFonts w:ascii="Inter" w:eastAsia="Inter" w:hAnsi="Inter" w:cs="Inter"/>
-          <w:color w:val="000000"/>
-        </w:rPr>
         <w:jc w:val="left"/>
         <w:spacing w:after="200"/>
         <w:numPr>
@@ -21258,10 +20536,6 @@
           <w:right w:val="nil"/>
           <w:between w:val="nil"/>
         </w:pBdr>
-        <w:rPr>
-          <w:rFonts w:ascii="Inter" w:eastAsia="Inter" w:hAnsi="Inter" w:cs="Inter"/>
-          <w:color w:val="000000"/>
-        </w:rPr>
         <w:jc w:val="left"/>
         <w:spacing w:after="200"/>
         <w:numPr>
@@ -21301,10 +20575,6 @@
           <w:right w:val="nil"/>
           <w:between w:val="nil"/>
         </w:pBdr>
-        <w:rPr>
-          <w:rFonts w:ascii="Inter" w:eastAsia="Inter" w:hAnsi="Inter" w:cs="Inter"/>
-          <w:color w:val="000000"/>
-        </w:rPr>
         <w:jc w:val="left"/>
         <w:spacing w:after="200"/>
         <w:numPr>
@@ -21344,10 +20614,6 @@
           <w:right w:val="nil"/>
           <w:between w:val="nil"/>
         </w:pBdr>
-        <w:rPr>
-          <w:rFonts w:ascii="Inter" w:eastAsia="Inter" w:hAnsi="Inter" w:cs="Inter"/>
-          <w:color w:val="000000"/>
-        </w:rPr>
         <w:jc w:val="left"/>
         <w:spacing w:after="200"/>
         <w:numPr>
@@ -21518,10 +20784,6 @@
           <w:right w:val="nil"/>
           <w:between w:val="nil"/>
         </w:pBdr>
-        <w:rPr>
-          <w:rFonts w:ascii="Inter" w:eastAsia="Inter" w:hAnsi="Inter" w:cs="Inter"/>
-          <w:color w:val="000000"/>
-        </w:rPr>
         <w:jc w:val="left"/>
         <w:spacing w:after="200"/>
         <w:numPr>
@@ -21621,10 +20883,6 @@
           <w:right w:val="nil"/>
           <w:between w:val="nil"/>
         </w:pBdr>
-        <w:rPr>
-          <w:rFonts w:ascii="Inter" w:eastAsia="Inter" w:hAnsi="Inter" w:cs="Inter"/>
-          <w:color w:val="000000"/>
-        </w:rPr>
         <w:jc w:val="left"/>
         <w:spacing w:after="200"/>
         <w:numPr>
@@ -21744,10 +21002,6 @@
           <w:right w:val="nil"/>
           <w:between w:val="nil"/>
         </w:pBdr>
-        <w:rPr>
-          <w:rFonts w:ascii="Inter" w:eastAsia="Inter" w:hAnsi="Inter" w:cs="Inter"/>
-          <w:color w:val="000000"/>
-        </w:rPr>
         <w:jc w:val="left"/>
         <w:spacing w:after="200"/>
         <w:numPr>
@@ -21796,10 +21050,6 @@
           <w:right w:val="nil"/>
           <w:between w:val="nil"/>
         </w:pBdr>
-        <w:rPr>
-          <w:rFonts w:ascii="Inter" w:eastAsia="Inter" w:hAnsi="Inter" w:cs="Inter"/>
-          <w:color w:val="000000"/>
-        </w:rPr>
         <w:jc w:val="left"/>
         <w:spacing w:after="200"/>
         <w:numPr>

</xml_diff>